<commit_message>
add AI and IoT slides
</commit_message>
<xml_diff>
--- a/comp-233/FinalSample.docx
+++ b/comp-233/FinalSample.docx
@@ -39,15 +39,13 @@
           <w:rFonts w:ascii="Arial" w:hAnsi="Arial" w:cs="Arial"/>
           <w:sz w:val="18"/>
           <w:szCs w:val="18"/>
-          <w:highlight w:val="yellow"/>
-        </w:rPr>
-      </w:pPr>
-      <w:r>
-        <w:rPr>
-          <w:rFonts w:ascii="Arial" w:hAnsi="Arial" w:cs="Arial"/>
-          <w:sz w:val="18"/>
-          <w:szCs w:val="18"/>
-          <w:highlight w:val="yellow"/>
+        </w:rPr>
+      </w:pPr>
+      <w:r>
+        <w:rPr>
+          <w:rFonts w:ascii="Arial" w:hAnsi="Arial" w:cs="Arial"/>
+          <w:sz w:val="18"/>
+          <w:szCs w:val="18"/>
         </w:rPr>
         <w:t>Managing memory limits on microcontrollers</w:t>
       </w:r>
@@ -56,7 +54,6 @@
           <w:rFonts w:ascii="Arial" w:hAnsi="Arial" w:cs="Arial"/>
           <w:sz w:val="18"/>
           <w:szCs w:val="18"/>
-          <w:highlight w:val="yellow"/>
         </w:rPr>
         <w:t xml:space="preserve"> (correct)</w:t>
       </w:r>
@@ -194,15 +191,13 @@
           <w:rFonts w:ascii="Arial" w:hAnsi="Arial" w:cs="Arial"/>
           <w:sz w:val="18"/>
           <w:szCs w:val="18"/>
-          <w:highlight w:val="yellow"/>
-        </w:rPr>
-      </w:pPr>
-      <w:r>
-        <w:rPr>
-          <w:rFonts w:ascii="Arial" w:hAnsi="Arial" w:cs="Arial"/>
-          <w:sz w:val="18"/>
-          <w:szCs w:val="18"/>
-          <w:highlight w:val="yellow"/>
+        </w:rPr>
+      </w:pPr>
+      <w:r>
+        <w:rPr>
+          <w:rFonts w:ascii="Arial" w:hAnsi="Arial" w:cs="Arial"/>
+          <w:sz w:val="18"/>
+          <w:szCs w:val="18"/>
         </w:rPr>
         <w:t>Handling spotty connection and saving power</w:t>
       </w:r>
@@ -211,7 +206,6 @@
           <w:rFonts w:ascii="Arial" w:hAnsi="Arial" w:cs="Arial"/>
           <w:sz w:val="18"/>
           <w:szCs w:val="18"/>
-          <w:highlight w:val="yellow"/>
         </w:rPr>
         <w:t xml:space="preserve"> (correct)</w:t>
       </w:r>
@@ -341,15 +335,13 @@
           <w:rFonts w:ascii="Arial" w:hAnsi="Arial" w:cs="Arial"/>
           <w:sz w:val="18"/>
           <w:szCs w:val="18"/>
-          <w:highlight w:val="yellow"/>
-        </w:rPr>
-      </w:pPr>
-      <w:r>
-        <w:rPr>
-          <w:rFonts w:ascii="Arial" w:hAnsi="Arial" w:cs="Arial"/>
-          <w:sz w:val="18"/>
-          <w:szCs w:val="18"/>
-          <w:highlight w:val="yellow"/>
+        </w:rPr>
+      </w:pPr>
+      <w:r>
+        <w:rPr>
+          <w:rFonts w:ascii="Arial" w:hAnsi="Arial" w:cs="Arial"/>
+          <w:sz w:val="18"/>
+          <w:szCs w:val="18"/>
         </w:rPr>
         <w:t>Implementing and integrating components</w:t>
       </w:r>
@@ -491,15 +483,13 @@
           <w:rFonts w:ascii="Arial" w:hAnsi="Arial" w:cs="Arial"/>
           <w:sz w:val="18"/>
           <w:szCs w:val="18"/>
-          <w:highlight w:val="yellow"/>
-        </w:rPr>
-      </w:pPr>
-      <w:r>
-        <w:rPr>
-          <w:rFonts w:ascii="Arial" w:hAnsi="Arial" w:cs="Arial"/>
-          <w:sz w:val="18"/>
-          <w:szCs w:val="18"/>
-          <w:highlight w:val="yellow"/>
+        </w:rPr>
+      </w:pPr>
+      <w:r>
+        <w:rPr>
+          <w:rFonts w:ascii="Arial" w:hAnsi="Arial" w:cs="Arial"/>
+          <w:sz w:val="18"/>
+          <w:szCs w:val="18"/>
         </w:rPr>
         <w:t>Table schema update to add new attributes</w:t>
       </w:r>
@@ -585,15 +575,13 @@
           <w:rFonts w:ascii="Arial" w:hAnsi="Arial" w:cs="Arial"/>
           <w:sz w:val="18"/>
           <w:szCs w:val="18"/>
-          <w:highlight w:val="yellow"/>
-        </w:rPr>
-      </w:pPr>
-      <w:r>
-        <w:rPr>
-          <w:rFonts w:ascii="Arial" w:hAnsi="Arial" w:cs="Arial"/>
-          <w:sz w:val="18"/>
-          <w:szCs w:val="18"/>
-          <w:highlight w:val="yellow"/>
+        </w:rPr>
+      </w:pPr>
+      <w:r>
+        <w:rPr>
+          <w:rFonts w:ascii="Arial" w:hAnsi="Arial" w:cs="Arial"/>
+          <w:sz w:val="18"/>
+          <w:szCs w:val="18"/>
         </w:rPr>
         <w:t>One large, centralized team</w:t>
       </w:r>
@@ -665,19 +653,1682 @@
           <w:sz w:val="18"/>
           <w:szCs w:val="18"/>
         </w:rPr>
-        <w:t xml:space="preserve">In the V-Model, if a user story </w:t>
-      </w:r>
-      <w:r>
+        <w:t>In the V-Model, if a user story validation fails after implementation, what is the correct next step?</w:t>
+      </w:r>
+    </w:p>
+    <w:p>
+      <w:pPr>
+        <w:pStyle w:val="ListParagraph"/>
+        <w:numPr>
+          <w:ilvl w:val="0"/>
+          <w:numId w:val="2"/>
+        </w:numPr>
+        <w:spacing w:after="240" w:line="240" w:lineRule="auto"/>
+        <w:rPr>
+          <w:rFonts w:ascii="Arial" w:eastAsia="Arial" w:hAnsi="Arial" w:cs="Arial"/>
+          <w:sz w:val="18"/>
+          <w:szCs w:val="18"/>
+        </w:rPr>
+      </w:pPr>
+      <w:r>
+        <w:rPr>
+          <w:rFonts w:ascii="Arial" w:hAnsi="Arial" w:cs="Arial"/>
+          <w:sz w:val="18"/>
+          <w:szCs w:val="18"/>
+        </w:rPr>
+        <w:t>Escalate to design phase</w:t>
+      </w:r>
+    </w:p>
+    <w:p>
+      <w:pPr>
+        <w:pStyle w:val="ListParagraph"/>
+        <w:numPr>
+          <w:ilvl w:val="0"/>
+          <w:numId w:val="2"/>
+        </w:numPr>
+        <w:spacing w:after="240" w:line="240" w:lineRule="auto"/>
+        <w:rPr>
+          <w:rFonts w:ascii="Arial" w:eastAsia="Arial" w:hAnsi="Arial" w:cs="Arial"/>
+          <w:sz w:val="18"/>
+          <w:szCs w:val="18"/>
+        </w:rPr>
+      </w:pPr>
+      <w:r>
+        <w:rPr>
+          <w:rFonts w:ascii="Arial" w:hAnsi="Arial" w:cs="Arial"/>
+          <w:sz w:val="18"/>
+          <w:szCs w:val="18"/>
+        </w:rPr>
+        <w:t>Escalate to requirements verification phase</w:t>
+      </w:r>
+    </w:p>
+    <w:p>
+      <w:pPr>
+        <w:pStyle w:val="ListParagraph"/>
+        <w:numPr>
+          <w:ilvl w:val="0"/>
+          <w:numId w:val="2"/>
+        </w:numPr>
+        <w:spacing w:after="240" w:line="240" w:lineRule="auto"/>
+        <w:rPr>
+          <w:rFonts w:ascii="Arial" w:eastAsia="Arial" w:hAnsi="Arial" w:cs="Arial"/>
+          <w:sz w:val="18"/>
+          <w:szCs w:val="18"/>
+        </w:rPr>
+      </w:pPr>
+      <w:r>
+        <w:rPr>
+          <w:rFonts w:ascii="Arial" w:hAnsi="Arial" w:cs="Arial"/>
+          <w:sz w:val="18"/>
+          <w:szCs w:val="18"/>
+        </w:rPr>
+        <w:t>Escalate to system testing phase</w:t>
+      </w:r>
+    </w:p>
+    <w:p>
+      <w:pPr>
+        <w:pStyle w:val="ListParagraph"/>
+        <w:numPr>
+          <w:ilvl w:val="0"/>
+          <w:numId w:val="2"/>
+        </w:numPr>
+        <w:spacing w:after="240" w:line="240" w:lineRule="auto"/>
+        <w:rPr>
+          <w:rFonts w:ascii="Arial" w:eastAsia="Arial" w:hAnsi="Arial" w:cs="Arial"/>
+          <w:sz w:val="18"/>
+          <w:szCs w:val="18"/>
+        </w:rPr>
+      </w:pPr>
+      <w:r>
+        <w:rPr>
+          <w:rFonts w:ascii="Arial" w:hAnsi="Arial" w:cs="Arial"/>
+          <w:sz w:val="18"/>
+          <w:szCs w:val="18"/>
+        </w:rPr>
+        <w:t>Escalate to next development cycle</w:t>
+      </w:r>
+    </w:p>
+    <w:p>
+      <w:pPr>
+        <w:pStyle w:val="NormalWeb"/>
+        <w:numPr>
+          <w:ilvl w:val="0"/>
+          <w:numId w:val="26"/>
+        </w:numPr>
+        <w:rPr>
+          <w:rStyle w:val="Strong"/>
+          <w:rFonts w:ascii="Arial" w:eastAsiaTheme="majorEastAsia" w:hAnsi="Arial" w:cs="Arial"/>
+          <w:sz w:val="18"/>
+          <w:szCs w:val="18"/>
+        </w:rPr>
+      </w:pPr>
+      <w:r>
+        <w:rPr>
+          <w:rStyle w:val="Strong"/>
+          <w:rFonts w:ascii="Arial" w:eastAsiaTheme="majorEastAsia" w:hAnsi="Arial" w:cs="Arial"/>
+          <w:sz w:val="18"/>
+          <w:szCs w:val="18"/>
+        </w:rPr>
+        <w:t>In the V-Model, if architecture verification fails in a plant watering IoT system, what should happen next?</w:t>
+      </w:r>
+    </w:p>
+    <w:p>
+      <w:pPr>
+        <w:pStyle w:val="NormalWeb"/>
+        <w:numPr>
+          <w:ilvl w:val="0"/>
+          <w:numId w:val="12"/>
+        </w:numPr>
+        <w:rPr>
+          <w:rStyle w:val="Strong"/>
+          <w:rFonts w:ascii="Arial" w:eastAsiaTheme="majorEastAsia" w:hAnsi="Arial" w:cs="Arial"/>
+          <w:b w:val="0"/>
+          <w:bCs w:val="0"/>
+          <w:sz w:val="18"/>
+          <w:szCs w:val="18"/>
+        </w:rPr>
+      </w:pPr>
+      <w:r>
+        <w:rPr>
+          <w:rStyle w:val="Strong"/>
+          <w:rFonts w:ascii="Arial" w:eastAsiaTheme="majorEastAsia" w:hAnsi="Arial" w:cs="Arial"/>
+          <w:b w:val="0"/>
+          <w:bCs w:val="0"/>
+          <w:sz w:val="18"/>
+          <w:szCs w:val="18"/>
+        </w:rPr>
+        <w:t>Move to coding anyway</w:t>
+      </w:r>
+    </w:p>
+    <w:p>
+      <w:pPr>
+        <w:pStyle w:val="NormalWeb"/>
+        <w:numPr>
+          <w:ilvl w:val="0"/>
+          <w:numId w:val="12"/>
+        </w:numPr>
+        <w:rPr>
+          <w:rStyle w:val="Strong"/>
+          <w:rFonts w:ascii="Arial" w:eastAsiaTheme="majorEastAsia" w:hAnsi="Arial" w:cs="Arial"/>
+          <w:b w:val="0"/>
+          <w:bCs w:val="0"/>
+          <w:sz w:val="18"/>
+          <w:szCs w:val="18"/>
+        </w:rPr>
+      </w:pPr>
+      <w:r>
+        <w:rPr>
+          <w:rStyle w:val="Strong"/>
+          <w:rFonts w:ascii="Arial" w:eastAsiaTheme="majorEastAsia" w:hAnsi="Arial" w:cs="Arial"/>
+          <w:b w:val="0"/>
+          <w:bCs w:val="0"/>
+          <w:sz w:val="18"/>
+          <w:szCs w:val="18"/>
+        </w:rPr>
+        <w:t>Return to system design</w:t>
+      </w:r>
+    </w:p>
+    <w:p>
+      <w:pPr>
+        <w:pStyle w:val="NormalWeb"/>
+        <w:numPr>
+          <w:ilvl w:val="0"/>
+          <w:numId w:val="12"/>
+        </w:numPr>
+        <w:rPr>
+          <w:rStyle w:val="Strong"/>
+          <w:rFonts w:ascii="Arial" w:eastAsiaTheme="majorEastAsia" w:hAnsi="Arial" w:cs="Arial"/>
+          <w:b w:val="0"/>
+          <w:bCs w:val="0"/>
+          <w:sz w:val="18"/>
+          <w:szCs w:val="18"/>
+        </w:rPr>
+      </w:pPr>
+      <w:r>
+        <w:rPr>
+          <w:rStyle w:val="Strong"/>
+          <w:rFonts w:ascii="Arial" w:eastAsiaTheme="majorEastAsia" w:hAnsi="Arial" w:cs="Arial"/>
+          <w:b w:val="0"/>
+          <w:bCs w:val="0"/>
+          <w:sz w:val="18"/>
+          <w:szCs w:val="18"/>
+        </w:rPr>
+        <w:t>Start integration testing</w:t>
+      </w:r>
+    </w:p>
+    <w:p>
+      <w:pPr>
+        <w:pStyle w:val="NormalWeb"/>
+        <w:numPr>
+          <w:ilvl w:val="0"/>
+          <w:numId w:val="12"/>
+        </w:numPr>
+        <w:rPr>
+          <w:rStyle w:val="Strong"/>
+          <w:rFonts w:ascii="Arial" w:hAnsi="Arial" w:cs="Arial"/>
+          <w:b w:val="0"/>
+          <w:bCs w:val="0"/>
+          <w:sz w:val="18"/>
+          <w:szCs w:val="18"/>
+        </w:rPr>
+      </w:pPr>
+      <w:r>
+        <w:rPr>
+          <w:rStyle w:val="Strong"/>
+          <w:rFonts w:ascii="Arial" w:eastAsiaTheme="majorEastAsia" w:hAnsi="Arial" w:cs="Arial"/>
+          <w:b w:val="0"/>
+          <w:bCs w:val="0"/>
+          <w:sz w:val="18"/>
+          <w:szCs w:val="18"/>
+        </w:rPr>
+        <w:t>Update unit test cases</w:t>
+      </w:r>
+    </w:p>
+    <w:p>
+      <w:pPr>
+        <w:pStyle w:val="NormalWeb"/>
+        <w:ind w:left="360"/>
+        <w:rPr>
+          <w:rStyle w:val="Strong"/>
+          <w:rFonts w:ascii="Arial" w:eastAsiaTheme="majorEastAsia" w:hAnsi="Arial" w:cs="Arial"/>
+          <w:sz w:val="18"/>
+          <w:szCs w:val="18"/>
+        </w:rPr>
+      </w:pPr>
+    </w:p>
+    <w:p>
+      <w:pPr>
+        <w:pStyle w:val="NormalWeb"/>
+        <w:ind w:left="360"/>
+        <w:rPr>
+          <w:rStyle w:val="Strong"/>
+          <w:rFonts w:ascii="Arial" w:eastAsiaTheme="majorEastAsia" w:hAnsi="Arial" w:cs="Arial"/>
+          <w:sz w:val="18"/>
+          <w:szCs w:val="18"/>
+        </w:rPr>
+      </w:pPr>
+    </w:p>
+    <w:p>
+      <w:pPr>
+        <w:pStyle w:val="NormalWeb"/>
+        <w:numPr>
+          <w:ilvl w:val="0"/>
+          <w:numId w:val="26"/>
+        </w:numPr>
+        <w:rPr>
+          <w:rStyle w:val="Strong"/>
+          <w:rFonts w:ascii="Arial" w:eastAsiaTheme="majorEastAsia" w:hAnsi="Arial" w:cs="Arial"/>
+          <w:sz w:val="18"/>
+          <w:szCs w:val="18"/>
+        </w:rPr>
+      </w:pPr>
+      <w:r>
+        <w:rPr>
+          <w:rStyle w:val="Strong"/>
+          <w:rFonts w:ascii="Arial" w:eastAsiaTheme="majorEastAsia" w:hAnsi="Arial" w:cs="Arial"/>
+          <w:sz w:val="18"/>
+          <w:szCs w:val="18"/>
+        </w:rPr>
+        <w:t>Why can’t the backlogs for Agile and V-Model be the same in a plant watering IoT system project?</w:t>
+      </w:r>
+    </w:p>
+    <w:p>
+      <w:pPr>
+        <w:pStyle w:val="NormalWeb"/>
+        <w:numPr>
+          <w:ilvl w:val="0"/>
+          <w:numId w:val="13"/>
+        </w:numPr>
+        <w:rPr>
+          <w:rStyle w:val="Strong"/>
+          <w:rFonts w:ascii="Arial" w:eastAsiaTheme="majorEastAsia" w:hAnsi="Arial" w:cs="Arial"/>
+          <w:b w:val="0"/>
+          <w:bCs w:val="0"/>
+          <w:sz w:val="18"/>
+          <w:szCs w:val="18"/>
+        </w:rPr>
+      </w:pPr>
+      <w:r>
+        <w:rPr>
+          <w:rStyle w:val="Strong"/>
+          <w:rFonts w:ascii="Arial" w:eastAsiaTheme="majorEastAsia" w:hAnsi="Arial" w:cs="Arial"/>
+          <w:b w:val="0"/>
+          <w:bCs w:val="0"/>
+          <w:sz w:val="18"/>
+          <w:szCs w:val="18"/>
+        </w:rPr>
+        <w:t>Agile doesn’t define backlog items, but V-Model does</w:t>
+      </w:r>
+    </w:p>
+    <w:p>
+      <w:pPr>
+        <w:pStyle w:val="NormalWeb"/>
+        <w:numPr>
+          <w:ilvl w:val="0"/>
+          <w:numId w:val="13"/>
+        </w:numPr>
+        <w:rPr>
+          <w:rStyle w:val="Strong"/>
+          <w:rFonts w:ascii="Arial" w:eastAsiaTheme="majorEastAsia" w:hAnsi="Arial" w:cs="Arial"/>
+          <w:b w:val="0"/>
+          <w:bCs w:val="0"/>
+          <w:sz w:val="18"/>
+          <w:szCs w:val="18"/>
+        </w:rPr>
+      </w:pPr>
+      <w:r>
+        <w:rPr>
+          <w:rStyle w:val="Strong"/>
+          <w:rFonts w:ascii="Arial" w:eastAsiaTheme="majorEastAsia" w:hAnsi="Arial" w:cs="Arial"/>
+          <w:b w:val="0"/>
+          <w:bCs w:val="0"/>
+          <w:sz w:val="18"/>
+          <w:szCs w:val="18"/>
+        </w:rPr>
+        <w:t>The V-Model backlog is static, while Agile requires flexibility</w:t>
+      </w:r>
+    </w:p>
+    <w:p>
+      <w:pPr>
+        <w:pStyle w:val="NormalWeb"/>
+        <w:numPr>
+          <w:ilvl w:val="0"/>
+          <w:numId w:val="13"/>
+        </w:numPr>
+        <w:rPr>
+          <w:rStyle w:val="Strong"/>
+          <w:rFonts w:ascii="Arial" w:eastAsiaTheme="majorEastAsia" w:hAnsi="Arial" w:cs="Arial"/>
+          <w:b w:val="0"/>
+          <w:bCs w:val="0"/>
+          <w:sz w:val="18"/>
+          <w:szCs w:val="18"/>
+        </w:rPr>
+      </w:pPr>
+      <w:r>
+        <w:rPr>
+          <w:rStyle w:val="Strong"/>
+          <w:rFonts w:ascii="Arial" w:eastAsiaTheme="majorEastAsia" w:hAnsi="Arial" w:cs="Arial"/>
+          <w:b w:val="0"/>
+          <w:bCs w:val="0"/>
+          <w:sz w:val="18"/>
+          <w:szCs w:val="18"/>
+        </w:rPr>
+        <w:t>Agile backlogs are only for UI tasks, while the V-Model backlog focuses on testing</w:t>
+      </w:r>
+    </w:p>
+    <w:p>
+      <w:pPr>
+        <w:pStyle w:val="NormalWeb"/>
+        <w:numPr>
+          <w:ilvl w:val="0"/>
+          <w:numId w:val="13"/>
+        </w:numPr>
+        <w:rPr>
+          <w:rFonts w:ascii="Arial" w:eastAsia="Arial" w:hAnsi="Arial" w:cs="Arial"/>
+          <w:sz w:val="18"/>
+          <w:szCs w:val="18"/>
+        </w:rPr>
+      </w:pPr>
+      <w:r>
+        <w:rPr>
+          <w:rStyle w:val="Strong"/>
+          <w:rFonts w:ascii="Arial" w:eastAsiaTheme="majorEastAsia" w:hAnsi="Arial" w:cs="Arial"/>
+          <w:b w:val="0"/>
+          <w:bCs w:val="0"/>
+          <w:sz w:val="18"/>
+          <w:szCs w:val="18"/>
+        </w:rPr>
+        <w:t>V-Model backlogs are predefined at the start, while Agile evolves over time</w:t>
+      </w:r>
+    </w:p>
+    <w:p>
+      <w:pPr>
+        <w:pStyle w:val="NormalWeb"/>
+        <w:numPr>
+          <w:ilvl w:val="0"/>
+          <w:numId w:val="26"/>
+        </w:numPr>
+        <w:rPr>
+          <w:rStyle w:val="Strong"/>
+          <w:rFonts w:ascii="Arial" w:eastAsiaTheme="majorEastAsia" w:hAnsi="Arial" w:cs="Arial"/>
+          <w:sz w:val="18"/>
+          <w:szCs w:val="18"/>
+        </w:rPr>
+      </w:pPr>
+      <w:r>
+        <w:rPr>
+          <w:rStyle w:val="Strong"/>
+          <w:rFonts w:ascii="Arial" w:eastAsiaTheme="majorEastAsia" w:hAnsi="Arial" w:cs="Arial"/>
+          <w:sz w:val="18"/>
+          <w:szCs w:val="18"/>
+        </w:rPr>
+        <w:t>Which phase of the V-Model for a plant watering IoT system typically requires the most incremental steps?</w:t>
+      </w:r>
+    </w:p>
+    <w:p>
+      <w:pPr>
+        <w:pStyle w:val="NormalWeb"/>
+        <w:numPr>
+          <w:ilvl w:val="0"/>
+          <w:numId w:val="14"/>
+        </w:numPr>
+        <w:rPr>
+          <w:rStyle w:val="Strong"/>
+          <w:rFonts w:ascii="Arial" w:eastAsiaTheme="majorEastAsia" w:hAnsi="Arial" w:cs="Arial"/>
+          <w:b w:val="0"/>
+          <w:bCs w:val="0"/>
+          <w:sz w:val="18"/>
+          <w:szCs w:val="18"/>
+        </w:rPr>
+      </w:pPr>
+      <w:r>
+        <w:rPr>
+          <w:rStyle w:val="Strong"/>
+          <w:rFonts w:ascii="Arial" w:eastAsiaTheme="majorEastAsia" w:hAnsi="Arial" w:cs="Arial"/>
+          <w:b w:val="0"/>
+          <w:bCs w:val="0"/>
+          <w:sz w:val="18"/>
+          <w:szCs w:val="18"/>
+        </w:rPr>
+        <w:t>Requirement’s analysis</w:t>
+      </w:r>
+    </w:p>
+    <w:p>
+      <w:pPr>
+        <w:pStyle w:val="NormalWeb"/>
+        <w:numPr>
+          <w:ilvl w:val="0"/>
+          <w:numId w:val="14"/>
+        </w:numPr>
+        <w:rPr>
+          <w:rStyle w:val="Strong"/>
+          <w:rFonts w:ascii="Arial" w:eastAsiaTheme="majorEastAsia" w:hAnsi="Arial" w:cs="Arial"/>
+          <w:b w:val="0"/>
+          <w:bCs w:val="0"/>
+          <w:sz w:val="18"/>
+          <w:szCs w:val="18"/>
+        </w:rPr>
+      </w:pPr>
+      <w:r>
+        <w:rPr>
+          <w:rStyle w:val="Strong"/>
+          <w:rFonts w:ascii="Arial" w:eastAsiaTheme="majorEastAsia" w:hAnsi="Arial" w:cs="Arial"/>
+          <w:b w:val="0"/>
+          <w:bCs w:val="0"/>
+          <w:sz w:val="18"/>
+          <w:szCs w:val="18"/>
+        </w:rPr>
+        <w:t>System design</w:t>
+      </w:r>
+    </w:p>
+    <w:p>
+      <w:pPr>
+        <w:pStyle w:val="NormalWeb"/>
+        <w:numPr>
+          <w:ilvl w:val="0"/>
+          <w:numId w:val="14"/>
+        </w:numPr>
+        <w:rPr>
+          <w:rStyle w:val="Strong"/>
+          <w:rFonts w:ascii="Arial" w:eastAsiaTheme="majorEastAsia" w:hAnsi="Arial" w:cs="Arial"/>
+          <w:b w:val="0"/>
+          <w:bCs w:val="0"/>
+          <w:sz w:val="18"/>
+          <w:szCs w:val="18"/>
+        </w:rPr>
+      </w:pPr>
+      <w:r>
+        <w:rPr>
+          <w:rStyle w:val="Strong"/>
+          <w:rFonts w:ascii="Arial" w:eastAsiaTheme="majorEastAsia" w:hAnsi="Arial" w:cs="Arial"/>
+          <w:b w:val="0"/>
+          <w:bCs w:val="0"/>
+          <w:sz w:val="18"/>
+          <w:szCs w:val="18"/>
+        </w:rPr>
+        <w:t>Testing and validation</w:t>
+      </w:r>
+    </w:p>
+    <w:p>
+      <w:pPr>
+        <w:pStyle w:val="NormalWeb"/>
+        <w:numPr>
+          <w:ilvl w:val="0"/>
+          <w:numId w:val="14"/>
+        </w:numPr>
+        <w:rPr>
+          <w:rFonts w:ascii="Arial" w:hAnsi="Arial" w:cs="Arial"/>
+          <w:sz w:val="18"/>
+          <w:szCs w:val="18"/>
+        </w:rPr>
+      </w:pPr>
+      <w:r>
+        <w:rPr>
+          <w:rStyle w:val="Strong"/>
+          <w:rFonts w:ascii="Arial" w:eastAsiaTheme="majorEastAsia" w:hAnsi="Arial" w:cs="Arial"/>
+          <w:b w:val="0"/>
+          <w:bCs w:val="0"/>
+          <w:sz w:val="18"/>
+          <w:szCs w:val="18"/>
+        </w:rPr>
+        <w:t>Deployment</w:t>
+      </w:r>
+    </w:p>
+    <w:p>
+      <w:pPr>
+        <w:pStyle w:val="NormalWeb"/>
+        <w:numPr>
+          <w:ilvl w:val="0"/>
+          <w:numId w:val="26"/>
+        </w:numPr>
+        <w:rPr>
+          <w:rStyle w:val="Strong"/>
+          <w:rFonts w:ascii="Arial" w:eastAsiaTheme="majorEastAsia" w:hAnsi="Arial" w:cs="Arial"/>
+          <w:sz w:val="18"/>
+          <w:szCs w:val="18"/>
+        </w:rPr>
+      </w:pPr>
+      <w:r>
+        <w:rPr>
+          <w:rStyle w:val="Strong"/>
+          <w:rFonts w:ascii="Arial" w:eastAsiaTheme="majorEastAsia" w:hAnsi="Arial" w:cs="Arial"/>
+          <w:sz w:val="18"/>
+          <w:szCs w:val="18"/>
+        </w:rPr>
+        <w:t>How does the architecture of the plant watering IoT system affect the scalability of development teams?</w:t>
+      </w:r>
+    </w:p>
+    <w:p>
+      <w:pPr>
+        <w:pStyle w:val="NormalWeb"/>
+        <w:numPr>
+          <w:ilvl w:val="0"/>
+          <w:numId w:val="15"/>
+        </w:numPr>
+        <w:rPr>
+          <w:rStyle w:val="Strong"/>
+          <w:rFonts w:ascii="Arial" w:eastAsiaTheme="majorEastAsia" w:hAnsi="Arial" w:cs="Arial"/>
+          <w:b w:val="0"/>
+          <w:bCs w:val="0"/>
+          <w:sz w:val="18"/>
+          <w:szCs w:val="18"/>
+        </w:rPr>
+      </w:pPr>
+      <w:r>
+        <w:rPr>
+          <w:rStyle w:val="Strong"/>
+          <w:rFonts w:ascii="Arial" w:eastAsiaTheme="majorEastAsia" w:hAnsi="Arial" w:cs="Arial"/>
+          <w:b w:val="0"/>
+          <w:bCs w:val="0"/>
+          <w:sz w:val="18"/>
+          <w:szCs w:val="18"/>
+        </w:rPr>
+        <w:t>Microservices architecture allows teams to</w:t>
+      </w:r>
+      <w:r>
+        <w:rPr>
+          <w:rStyle w:val="Strong"/>
+          <w:rFonts w:ascii="Arial" w:eastAsiaTheme="majorEastAsia" w:hAnsi="Arial" w:cs="Arial"/>
+          <w:b w:val="0"/>
+          <w:bCs w:val="0"/>
+          <w:sz w:val="18"/>
+          <w:szCs w:val="18"/>
+        </w:rPr>
+        <w:t xml:space="preserve"> (horizontal)</w:t>
+      </w:r>
+      <w:r>
+        <w:rPr>
+          <w:rStyle w:val="Strong"/>
+          <w:rFonts w:ascii="Arial" w:eastAsiaTheme="majorEastAsia" w:hAnsi="Arial" w:cs="Arial"/>
+          <w:b w:val="0"/>
+          <w:bCs w:val="0"/>
+          <w:sz w:val="18"/>
+          <w:szCs w:val="18"/>
+        </w:rPr>
+        <w:t xml:space="preserve"> scale independently by focusing on individual services</w:t>
+      </w:r>
+      <w:r>
+        <w:rPr>
+          <w:rStyle w:val="Strong"/>
+          <w:rFonts w:ascii="Arial" w:eastAsiaTheme="majorEastAsia" w:hAnsi="Arial" w:cs="Arial"/>
+          <w:b w:val="0"/>
+          <w:bCs w:val="0"/>
+          <w:sz w:val="18"/>
+          <w:szCs w:val="18"/>
+        </w:rPr>
+        <w:t xml:space="preserve"> </w:t>
+      </w:r>
+      <w:r>
+        <w:rPr>
+          <w:rStyle w:val="Strong"/>
+          <w:rFonts w:ascii="Arial" w:eastAsiaTheme="majorEastAsia" w:hAnsi="Arial" w:cs="Arial"/>
+          <w:sz w:val="18"/>
+          <w:szCs w:val="18"/>
+        </w:rPr>
+        <w:t>but not for IoT</w:t>
+      </w:r>
+    </w:p>
+    <w:p>
+      <w:pPr>
+        <w:pStyle w:val="NormalWeb"/>
+        <w:numPr>
+          <w:ilvl w:val="0"/>
+          <w:numId w:val="15"/>
+        </w:numPr>
+        <w:rPr>
+          <w:rStyle w:val="Strong"/>
+          <w:rFonts w:ascii="Arial" w:eastAsiaTheme="majorEastAsia" w:hAnsi="Arial" w:cs="Arial"/>
+          <w:b w:val="0"/>
+          <w:bCs w:val="0"/>
+          <w:sz w:val="18"/>
+          <w:szCs w:val="18"/>
+        </w:rPr>
+      </w:pPr>
+      <w:r>
+        <w:rPr>
+          <w:rStyle w:val="Strong"/>
+          <w:rFonts w:ascii="Arial" w:eastAsiaTheme="majorEastAsia" w:hAnsi="Arial" w:cs="Arial"/>
+          <w:b w:val="0"/>
+          <w:bCs w:val="0"/>
+          <w:sz w:val="18"/>
+          <w:szCs w:val="18"/>
+        </w:rPr>
+        <w:t>A monolithic architecture limits</w:t>
+      </w:r>
+      <w:r>
+        <w:rPr>
+          <w:rStyle w:val="Strong"/>
+          <w:rFonts w:ascii="Arial" w:eastAsiaTheme="majorEastAsia" w:hAnsi="Arial" w:cs="Arial"/>
+          <w:b w:val="0"/>
+          <w:bCs w:val="0"/>
+          <w:sz w:val="18"/>
+          <w:szCs w:val="18"/>
+        </w:rPr>
+        <w:t xml:space="preserve"> (horizontal)</w:t>
+      </w:r>
+      <w:r>
+        <w:rPr>
+          <w:rStyle w:val="Strong"/>
+          <w:rFonts w:ascii="Arial" w:eastAsiaTheme="majorEastAsia" w:hAnsi="Arial" w:cs="Arial"/>
+          <w:b w:val="0"/>
+          <w:bCs w:val="0"/>
+          <w:sz w:val="18"/>
+          <w:szCs w:val="18"/>
+        </w:rPr>
+        <w:t xml:space="preserve"> scalability due to tightly coupled components</w:t>
+      </w:r>
+    </w:p>
+    <w:p>
+      <w:pPr>
+        <w:pStyle w:val="NormalWeb"/>
+        <w:numPr>
+          <w:ilvl w:val="0"/>
+          <w:numId w:val="15"/>
+        </w:numPr>
+        <w:rPr>
+          <w:rStyle w:val="Strong"/>
+          <w:rFonts w:ascii="Arial" w:eastAsiaTheme="majorEastAsia" w:hAnsi="Arial" w:cs="Arial"/>
+          <w:b w:val="0"/>
+          <w:bCs w:val="0"/>
+          <w:sz w:val="18"/>
+          <w:szCs w:val="18"/>
+        </w:rPr>
+      </w:pPr>
+      <w:r>
+        <w:rPr>
+          <w:rStyle w:val="Strong"/>
+          <w:rFonts w:ascii="Arial" w:eastAsiaTheme="majorEastAsia" w:hAnsi="Arial" w:cs="Arial"/>
+          <w:b w:val="0"/>
+          <w:bCs w:val="0"/>
+          <w:sz w:val="18"/>
+          <w:szCs w:val="18"/>
+        </w:rPr>
+        <w:t>Layered design requires more teams for each layer, but it scales easily</w:t>
+      </w:r>
+    </w:p>
+    <w:p>
+      <w:pPr>
+        <w:pStyle w:val="NormalWeb"/>
+        <w:numPr>
+          <w:ilvl w:val="0"/>
+          <w:numId w:val="15"/>
+        </w:numPr>
+        <w:rPr>
+          <w:rFonts w:ascii="Arial" w:hAnsi="Arial" w:cs="Arial"/>
+          <w:sz w:val="18"/>
+          <w:szCs w:val="18"/>
+        </w:rPr>
+      </w:pPr>
+      <w:r>
+        <w:rPr>
+          <w:rStyle w:val="Strong"/>
+          <w:rFonts w:ascii="Arial" w:eastAsiaTheme="majorEastAsia" w:hAnsi="Arial" w:cs="Arial"/>
+          <w:b w:val="0"/>
+          <w:bCs w:val="0"/>
+          <w:sz w:val="18"/>
+          <w:szCs w:val="18"/>
+        </w:rPr>
+        <w:t>Serverless architecture scales automatically, requiring no extra team effort</w:t>
+      </w:r>
+    </w:p>
+    <w:p>
+      <w:pPr>
+        <w:pStyle w:val="NormalWeb"/>
+        <w:numPr>
+          <w:ilvl w:val="0"/>
+          <w:numId w:val="26"/>
+        </w:numPr>
+        <w:rPr>
+          <w:rFonts w:ascii="Arial" w:hAnsi="Arial" w:cs="Arial"/>
+          <w:sz w:val="18"/>
+          <w:szCs w:val="18"/>
+        </w:rPr>
+      </w:pPr>
+      <w:r>
+        <w:rPr>
+          <w:rStyle w:val="Strong"/>
+          <w:rFonts w:ascii="Arial" w:eastAsiaTheme="majorEastAsia" w:hAnsi="Arial" w:cs="Arial"/>
+          <w:sz w:val="18"/>
+          <w:szCs w:val="18"/>
+        </w:rPr>
+        <w:t>How does the V-Model address compliance</w:t>
+      </w:r>
+      <w:r>
+        <w:rPr>
+          <w:rStyle w:val="Strong"/>
+          <w:rFonts w:ascii="Arial" w:eastAsiaTheme="majorEastAsia" w:hAnsi="Arial" w:cs="Arial"/>
+          <w:sz w:val="18"/>
+          <w:szCs w:val="18"/>
+        </w:rPr>
+        <w:t xml:space="preserve"> with legal requirements</w:t>
+      </w:r>
+      <w:r>
+        <w:rPr>
+          <w:rStyle w:val="Strong"/>
+          <w:rFonts w:ascii="Arial" w:eastAsiaTheme="majorEastAsia" w:hAnsi="Arial" w:cs="Arial"/>
+          <w:sz w:val="18"/>
+          <w:szCs w:val="18"/>
+        </w:rPr>
+        <w:t>?</w:t>
+      </w:r>
+    </w:p>
+    <w:p>
+      <w:pPr>
+        <w:pStyle w:val="NormalWeb"/>
+        <w:numPr>
+          <w:ilvl w:val="0"/>
+          <w:numId w:val="3"/>
+        </w:numPr>
+        <w:rPr>
+          <w:rFonts w:ascii="Arial" w:hAnsi="Arial" w:cs="Arial"/>
+          <w:sz w:val="18"/>
+          <w:szCs w:val="18"/>
+        </w:rPr>
+      </w:pPr>
+      <w:r>
+        <w:rPr>
+          <w:rFonts w:ascii="Arial" w:hAnsi="Arial" w:cs="Arial"/>
+          <w:sz w:val="18"/>
+          <w:szCs w:val="18"/>
+        </w:rPr>
+        <w:t>By ensuring legal compliance is checked only during the deployment phase</w:t>
+      </w:r>
+    </w:p>
+    <w:p>
+      <w:pPr>
+        <w:pStyle w:val="NormalWeb"/>
+        <w:numPr>
+          <w:ilvl w:val="0"/>
+          <w:numId w:val="3"/>
+        </w:numPr>
+        <w:rPr>
+          <w:rFonts w:ascii="Arial" w:hAnsi="Arial" w:cs="Arial"/>
+          <w:sz w:val="18"/>
+          <w:szCs w:val="18"/>
+        </w:rPr>
+      </w:pPr>
+      <w:r>
+        <w:rPr>
+          <w:rFonts w:ascii="Arial" w:hAnsi="Arial" w:cs="Arial"/>
+          <w:sz w:val="18"/>
+          <w:szCs w:val="18"/>
+        </w:rPr>
+        <w:t xml:space="preserve">Through </w:t>
+      </w:r>
+      <w:r>
+        <w:rPr>
+          <w:rFonts w:ascii="Arial" w:hAnsi="Arial" w:cs="Arial"/>
+          <w:sz w:val="18"/>
+          <w:szCs w:val="18"/>
+        </w:rPr>
+        <w:t xml:space="preserve">emphasize on </w:t>
+      </w:r>
+      <w:r>
+        <w:rPr>
+          <w:rFonts w:ascii="Arial" w:hAnsi="Arial" w:cs="Arial"/>
+          <w:sz w:val="18"/>
+          <w:szCs w:val="18"/>
+        </w:rPr>
+        <w:t>verification</w:t>
+      </w:r>
+      <w:r>
+        <w:rPr>
+          <w:rFonts w:ascii="Arial" w:hAnsi="Arial" w:cs="Arial"/>
+          <w:sz w:val="18"/>
+          <w:szCs w:val="18"/>
+        </w:rPr>
+        <w:t xml:space="preserve">, </w:t>
+      </w:r>
+      <w:r>
+        <w:rPr>
+          <w:rFonts w:ascii="Arial" w:hAnsi="Arial" w:cs="Arial"/>
+          <w:sz w:val="18"/>
+          <w:szCs w:val="18"/>
+        </w:rPr>
+        <w:t>validation</w:t>
+      </w:r>
+      <w:r>
+        <w:rPr>
+          <w:rFonts w:ascii="Arial" w:hAnsi="Arial" w:cs="Arial"/>
+          <w:sz w:val="18"/>
+          <w:szCs w:val="18"/>
+        </w:rPr>
+        <w:t>, and</w:t>
+      </w:r>
+      <w:r>
+        <w:rPr>
+          <w:rFonts w:ascii="Arial" w:hAnsi="Arial" w:cs="Arial"/>
+          <w:sz w:val="18"/>
+          <w:szCs w:val="18"/>
+        </w:rPr>
+        <w:t xml:space="preserve"> testing</w:t>
+      </w:r>
+    </w:p>
+    <w:p>
+      <w:pPr>
+        <w:pStyle w:val="NormalWeb"/>
+        <w:numPr>
+          <w:ilvl w:val="0"/>
+          <w:numId w:val="3"/>
+        </w:numPr>
+        <w:rPr>
+          <w:rFonts w:ascii="Arial" w:hAnsi="Arial" w:cs="Arial"/>
+          <w:sz w:val="18"/>
+          <w:szCs w:val="18"/>
+        </w:rPr>
+      </w:pPr>
+      <w:r>
+        <w:rPr>
+          <w:rFonts w:ascii="Arial" w:hAnsi="Arial" w:cs="Arial"/>
+          <w:sz w:val="18"/>
+          <w:szCs w:val="18"/>
+        </w:rPr>
+        <w:t>By skipping testing and focusing solely on design and documentation</w:t>
+      </w:r>
+    </w:p>
+    <w:p>
+      <w:pPr>
+        <w:pStyle w:val="NormalWeb"/>
+        <w:numPr>
+          <w:ilvl w:val="0"/>
+          <w:numId w:val="3"/>
+        </w:numPr>
+        <w:rPr>
+          <w:rFonts w:ascii="Arial" w:hAnsi="Arial" w:cs="Arial"/>
+          <w:sz w:val="18"/>
+          <w:szCs w:val="18"/>
+        </w:rPr>
+      </w:pPr>
+      <w:r>
+        <w:rPr>
+          <w:rFonts w:ascii="Arial" w:hAnsi="Arial" w:cs="Arial"/>
+          <w:sz w:val="18"/>
+          <w:szCs w:val="18"/>
+        </w:rPr>
+        <w:t>By relying on external audits after the project is completed</w:t>
+      </w:r>
+    </w:p>
+    <w:p>
+      <w:pPr>
+        <w:pStyle w:val="NormalWeb"/>
+        <w:numPr>
+          <w:ilvl w:val="0"/>
+          <w:numId w:val="26"/>
+        </w:numPr>
+        <w:rPr>
+          <w:rFonts w:ascii="Arial" w:hAnsi="Arial" w:cs="Arial"/>
+          <w:sz w:val="18"/>
+          <w:szCs w:val="18"/>
+        </w:rPr>
+      </w:pPr>
+      <w:r>
+        <w:rPr>
+          <w:rStyle w:val="Strong"/>
+          <w:rFonts w:ascii="Arial" w:eastAsiaTheme="majorEastAsia" w:hAnsi="Arial" w:cs="Arial"/>
+          <w:sz w:val="18"/>
+          <w:szCs w:val="18"/>
+        </w:rPr>
+        <w:t>What is the difference between verification, validation, and testing?</w:t>
+      </w:r>
+    </w:p>
+    <w:p>
+      <w:pPr>
+        <w:pStyle w:val="NormalWeb"/>
+        <w:numPr>
+          <w:ilvl w:val="0"/>
+          <w:numId w:val="4"/>
+        </w:numPr>
+        <w:rPr>
+          <w:rFonts w:ascii="Arial" w:hAnsi="Arial" w:cs="Arial"/>
+          <w:sz w:val="18"/>
+          <w:szCs w:val="18"/>
+        </w:rPr>
+      </w:pPr>
+      <w:r>
+        <w:rPr>
+          <w:rFonts w:ascii="Arial" w:hAnsi="Arial" w:cs="Arial"/>
+          <w:sz w:val="18"/>
+          <w:szCs w:val="18"/>
+        </w:rPr>
+        <w:t xml:space="preserve">Verification ensures </w:t>
+      </w:r>
+      <w:r>
+        <w:rPr>
+          <w:rFonts w:ascii="Arial" w:hAnsi="Arial" w:cs="Arial"/>
+          <w:sz w:val="18"/>
+          <w:szCs w:val="18"/>
+        </w:rPr>
+        <w:t>user/customer</w:t>
+      </w:r>
+      <w:r>
+        <w:rPr>
+          <w:rFonts w:ascii="Arial" w:hAnsi="Arial" w:cs="Arial"/>
+          <w:sz w:val="18"/>
+          <w:szCs w:val="18"/>
+        </w:rPr>
+        <w:t xml:space="preserve"> needs, validation checks functionality, and testing finds bugs</w:t>
+      </w:r>
+    </w:p>
+    <w:p>
+      <w:pPr>
+        <w:pStyle w:val="NormalWeb"/>
+        <w:numPr>
+          <w:ilvl w:val="0"/>
+          <w:numId w:val="4"/>
+        </w:numPr>
+        <w:rPr>
+          <w:rFonts w:ascii="Arial" w:hAnsi="Arial" w:cs="Arial"/>
+          <w:sz w:val="18"/>
+          <w:szCs w:val="18"/>
+        </w:rPr>
+      </w:pPr>
+      <w:r>
+        <w:rPr>
+          <w:rFonts w:ascii="Arial" w:hAnsi="Arial" w:cs="Arial"/>
+          <w:sz w:val="18"/>
+          <w:szCs w:val="18"/>
+        </w:rPr>
+        <w:t>Verification checks requirements, validation checks the right problem, and testing checks</w:t>
+      </w:r>
+      <w:r>
+        <w:rPr>
+          <w:rFonts w:ascii="Arial" w:hAnsi="Arial" w:cs="Arial"/>
+          <w:sz w:val="18"/>
+          <w:szCs w:val="18"/>
+        </w:rPr>
+        <w:t xml:space="preserve"> errors</w:t>
+      </w:r>
+    </w:p>
+    <w:p>
+      <w:pPr>
+        <w:pStyle w:val="NormalWeb"/>
+        <w:numPr>
+          <w:ilvl w:val="0"/>
+          <w:numId w:val="4"/>
+        </w:numPr>
+        <w:rPr>
+          <w:rFonts w:ascii="Arial" w:hAnsi="Arial" w:cs="Arial"/>
+          <w:sz w:val="18"/>
+          <w:szCs w:val="18"/>
+        </w:rPr>
+      </w:pPr>
+      <w:r>
+        <w:rPr>
+          <w:rFonts w:ascii="Arial" w:hAnsi="Arial" w:cs="Arial"/>
+          <w:sz w:val="18"/>
+          <w:szCs w:val="18"/>
+        </w:rPr>
+        <w:t>Verification and validation are the same, testing is done at the end</w:t>
+      </w:r>
+    </w:p>
+    <w:p>
+      <w:pPr>
+        <w:pStyle w:val="NormalWeb"/>
+        <w:numPr>
+          <w:ilvl w:val="0"/>
+          <w:numId w:val="4"/>
+        </w:numPr>
+        <w:rPr>
+          <w:rFonts w:ascii="Arial" w:hAnsi="Arial" w:cs="Arial"/>
+          <w:sz w:val="18"/>
+          <w:szCs w:val="18"/>
+        </w:rPr>
+      </w:pPr>
+      <w:r>
+        <w:rPr>
+          <w:rFonts w:ascii="Arial" w:hAnsi="Arial" w:cs="Arial"/>
+          <w:sz w:val="18"/>
+          <w:szCs w:val="18"/>
+        </w:rPr>
+        <w:t>Verification is during implementation, validation post-deployment, and no testing needed</w:t>
+      </w:r>
+    </w:p>
+    <w:p>
+      <w:pPr>
+        <w:pStyle w:val="NormalWeb"/>
+        <w:numPr>
+          <w:ilvl w:val="0"/>
+          <w:numId w:val="26"/>
+        </w:numPr>
+        <w:rPr>
+          <w:rFonts w:ascii="Arial" w:hAnsi="Arial" w:cs="Arial"/>
+          <w:sz w:val="18"/>
+          <w:szCs w:val="18"/>
+        </w:rPr>
+      </w:pPr>
+      <w:r>
+        <w:rPr>
+          <w:rStyle w:val="Strong"/>
+          <w:rFonts w:ascii="Arial" w:eastAsiaTheme="majorEastAsia" w:hAnsi="Arial" w:cs="Arial"/>
+          <w:sz w:val="18"/>
+          <w:szCs w:val="18"/>
+        </w:rPr>
+        <w:t>Which of the following best describes the "Arrange, Act, Assert"</w:t>
+      </w:r>
+      <w:r>
+        <w:rPr>
+          <w:rStyle w:val="Strong"/>
+          <w:rFonts w:ascii="Arial" w:eastAsiaTheme="majorEastAsia" w:hAnsi="Arial" w:cs="Arial"/>
+          <w:sz w:val="18"/>
+          <w:szCs w:val="18"/>
+        </w:rPr>
+        <w:t xml:space="preserve"> (AAA)</w:t>
+      </w:r>
+      <w:r>
+        <w:rPr>
+          <w:rStyle w:val="Strong"/>
+          <w:rFonts w:ascii="Arial" w:eastAsiaTheme="majorEastAsia" w:hAnsi="Arial" w:cs="Arial"/>
+          <w:sz w:val="18"/>
+          <w:szCs w:val="18"/>
+        </w:rPr>
+        <w:t xml:space="preserve"> pattern in testing?</w:t>
+      </w:r>
+    </w:p>
+    <w:p>
+      <w:pPr>
+        <w:pStyle w:val="NormalWeb"/>
+        <w:numPr>
+          <w:ilvl w:val="0"/>
+          <w:numId w:val="5"/>
+        </w:numPr>
+        <w:rPr>
+          <w:rFonts w:ascii="Arial" w:hAnsi="Arial" w:cs="Arial"/>
+          <w:sz w:val="18"/>
+          <w:szCs w:val="18"/>
+        </w:rPr>
+      </w:pPr>
+      <w:r>
+        <w:rPr>
+          <w:rFonts w:ascii="Arial" w:hAnsi="Arial" w:cs="Arial"/>
+          <w:sz w:val="18"/>
+          <w:szCs w:val="18"/>
+        </w:rPr>
+        <w:t xml:space="preserve">Arrange the </w:t>
+      </w:r>
+      <w:r>
+        <w:rPr>
+          <w:rFonts w:ascii="Arial" w:hAnsi="Arial" w:cs="Arial"/>
+          <w:sz w:val="18"/>
+          <w:szCs w:val="18"/>
+        </w:rPr>
+        <w:t>function</w:t>
+      </w:r>
+      <w:r>
+        <w:rPr>
+          <w:rFonts w:ascii="Arial" w:hAnsi="Arial" w:cs="Arial"/>
+          <w:sz w:val="18"/>
+          <w:szCs w:val="18"/>
+        </w:rPr>
+        <w:t>, assert expected behavior, and act to test</w:t>
+      </w:r>
+    </w:p>
+    <w:p>
+      <w:pPr>
+        <w:pStyle w:val="NormalWeb"/>
+        <w:numPr>
+          <w:ilvl w:val="0"/>
+          <w:numId w:val="5"/>
+        </w:numPr>
+        <w:rPr>
+          <w:rFonts w:ascii="Arial" w:hAnsi="Arial" w:cs="Arial"/>
+          <w:sz w:val="18"/>
+          <w:szCs w:val="18"/>
+        </w:rPr>
+      </w:pPr>
+      <w:proofErr w:type="spellStart"/>
+      <w:r>
+        <w:rPr>
+          <w:rFonts w:ascii="Arial" w:hAnsi="Arial" w:cs="Arial"/>
+          <w:sz w:val="18"/>
+          <w:szCs w:val="18"/>
+        </w:rPr>
+        <w:t>Act</w:t>
+      </w:r>
+      <w:proofErr w:type="spellEnd"/>
+      <w:r>
+        <w:rPr>
+          <w:rFonts w:ascii="Arial" w:hAnsi="Arial" w:cs="Arial"/>
+          <w:sz w:val="18"/>
+          <w:szCs w:val="18"/>
+        </w:rPr>
+        <w:t xml:space="preserve"> first, then arrange test data, and finally assert the expected result</w:t>
+      </w:r>
+    </w:p>
+    <w:p>
+      <w:pPr>
+        <w:pStyle w:val="NormalWeb"/>
+        <w:numPr>
+          <w:ilvl w:val="0"/>
+          <w:numId w:val="5"/>
+        </w:numPr>
+        <w:rPr>
+          <w:rFonts w:ascii="Arial" w:hAnsi="Arial" w:cs="Arial"/>
+          <w:sz w:val="18"/>
+          <w:szCs w:val="18"/>
+        </w:rPr>
+      </w:pPr>
+      <w:r>
+        <w:rPr>
+          <w:rFonts w:ascii="Arial" w:hAnsi="Arial" w:cs="Arial"/>
+          <w:sz w:val="18"/>
+          <w:szCs w:val="18"/>
+        </w:rPr>
+        <w:t>Arrange test data, act on the system, and assert the outcome</w:t>
+      </w:r>
+    </w:p>
+    <w:p>
+      <w:pPr>
+        <w:pStyle w:val="NormalWeb"/>
+        <w:numPr>
+          <w:ilvl w:val="0"/>
+          <w:numId w:val="5"/>
+        </w:numPr>
+        <w:rPr>
+          <w:rFonts w:ascii="Arial" w:hAnsi="Arial" w:cs="Arial"/>
+          <w:sz w:val="18"/>
+          <w:szCs w:val="18"/>
+        </w:rPr>
+      </w:pPr>
+      <w:r>
+        <w:rPr>
+          <w:rFonts w:ascii="Arial" w:hAnsi="Arial" w:cs="Arial"/>
+          <w:sz w:val="18"/>
+          <w:szCs w:val="18"/>
+        </w:rPr>
+        <w:t>Assert the behavior, act to modify it, and arrange the conditions</w:t>
+      </w:r>
+    </w:p>
+    <w:p>
+      <w:pPr>
+        <w:pStyle w:val="NormalWeb"/>
+        <w:numPr>
+          <w:ilvl w:val="0"/>
+          <w:numId w:val="26"/>
+        </w:numPr>
+        <w:rPr>
+          <w:rFonts w:ascii="Arial" w:hAnsi="Arial" w:cs="Arial"/>
+          <w:sz w:val="18"/>
+          <w:szCs w:val="18"/>
+        </w:rPr>
+      </w:pPr>
+      <w:r>
+        <w:rPr>
+          <w:rStyle w:val="Strong"/>
+          <w:rFonts w:ascii="Arial" w:eastAsiaTheme="majorEastAsia" w:hAnsi="Arial" w:cs="Arial"/>
+          <w:sz w:val="18"/>
+          <w:szCs w:val="18"/>
+        </w:rPr>
+        <w:t>Why is the AAA testing principle useful?</w:t>
+      </w:r>
+    </w:p>
+    <w:p>
+      <w:pPr>
+        <w:pStyle w:val="NormalWeb"/>
+        <w:numPr>
+          <w:ilvl w:val="0"/>
+          <w:numId w:val="6"/>
+        </w:numPr>
+        <w:rPr>
+          <w:rFonts w:ascii="Arial" w:hAnsi="Arial" w:cs="Arial"/>
+          <w:sz w:val="18"/>
+          <w:szCs w:val="18"/>
+        </w:rPr>
+      </w:pPr>
+      <w:r>
+        <w:rPr>
+          <w:rFonts w:ascii="Arial" w:hAnsi="Arial" w:cs="Arial"/>
+          <w:sz w:val="18"/>
+          <w:szCs w:val="18"/>
+        </w:rPr>
+        <w:t>It is only useful for unit tests</w:t>
+      </w:r>
+    </w:p>
+    <w:p>
+      <w:pPr>
+        <w:pStyle w:val="NormalWeb"/>
+        <w:numPr>
+          <w:ilvl w:val="0"/>
+          <w:numId w:val="6"/>
+        </w:numPr>
+        <w:rPr>
+          <w:rFonts w:ascii="Arial" w:hAnsi="Arial" w:cs="Arial"/>
+          <w:sz w:val="18"/>
+          <w:szCs w:val="18"/>
+        </w:rPr>
+      </w:pPr>
+      <w:r>
+        <w:rPr>
+          <w:rFonts w:ascii="Arial" w:hAnsi="Arial" w:cs="Arial"/>
+          <w:sz w:val="18"/>
+          <w:szCs w:val="18"/>
+        </w:rPr>
+        <w:t>It limits tests to Arrange and Assert steps</w:t>
+      </w:r>
+    </w:p>
+    <w:p>
+      <w:pPr>
+        <w:pStyle w:val="NormalWeb"/>
+        <w:numPr>
+          <w:ilvl w:val="0"/>
+          <w:numId w:val="6"/>
+        </w:numPr>
+        <w:rPr>
+          <w:rFonts w:ascii="Arial" w:hAnsi="Arial" w:cs="Arial"/>
+          <w:sz w:val="18"/>
+          <w:szCs w:val="18"/>
+        </w:rPr>
+      </w:pPr>
+      <w:r>
+        <w:rPr>
+          <w:rFonts w:ascii="Arial" w:hAnsi="Arial" w:cs="Arial"/>
+          <w:sz w:val="18"/>
+          <w:szCs w:val="18"/>
+        </w:rPr>
+        <w:t>It provides structured tests for all levels</w:t>
+      </w:r>
+    </w:p>
+    <w:p>
+      <w:pPr>
+        <w:pStyle w:val="NormalWeb"/>
+        <w:numPr>
+          <w:ilvl w:val="0"/>
+          <w:numId w:val="6"/>
+        </w:numPr>
+        <w:rPr>
+          <w:rFonts w:ascii="Arial" w:hAnsi="Arial" w:cs="Arial"/>
+          <w:sz w:val="18"/>
+          <w:szCs w:val="18"/>
+        </w:rPr>
+      </w:pPr>
+      <w:r>
+        <w:rPr>
+          <w:rFonts w:ascii="Arial" w:hAnsi="Arial" w:cs="Arial"/>
+          <w:sz w:val="18"/>
+          <w:szCs w:val="18"/>
+        </w:rPr>
+        <w:t>It works only for low-level tests</w:t>
+      </w:r>
+    </w:p>
+    <w:p>
+      <w:pPr>
+        <w:pStyle w:val="NormalWeb"/>
+        <w:rPr>
+          <w:rStyle w:val="Strong"/>
+          <w:rFonts w:ascii="Arial" w:eastAsiaTheme="majorEastAsia" w:hAnsi="Arial" w:cs="Arial"/>
+          <w:sz w:val="18"/>
+          <w:szCs w:val="18"/>
+        </w:rPr>
+      </w:pPr>
+    </w:p>
+    <w:p>
+      <w:pPr>
+        <w:pStyle w:val="NormalWeb"/>
+        <w:rPr>
+          <w:rStyle w:val="Strong"/>
+          <w:rFonts w:ascii="Arial" w:eastAsiaTheme="majorEastAsia" w:hAnsi="Arial" w:cs="Arial"/>
+          <w:sz w:val="18"/>
+          <w:szCs w:val="18"/>
+        </w:rPr>
+      </w:pPr>
+    </w:p>
+    <w:p>
+      <w:pPr>
+        <w:pStyle w:val="NormalWeb"/>
+        <w:numPr>
+          <w:ilvl w:val="0"/>
+          <w:numId w:val="26"/>
+        </w:numPr>
+        <w:rPr>
+          <w:rStyle w:val="Strong"/>
+          <w:rFonts w:ascii="Arial" w:eastAsiaTheme="majorEastAsia" w:hAnsi="Arial" w:cs="Arial"/>
+          <w:sz w:val="18"/>
+          <w:szCs w:val="18"/>
+        </w:rPr>
+      </w:pPr>
+      <w:r>
+        <w:rPr>
+          <w:rStyle w:val="Strong"/>
+          <w:rFonts w:ascii="Arial" w:eastAsiaTheme="majorEastAsia" w:hAnsi="Arial" w:cs="Arial"/>
+          <w:sz w:val="18"/>
+          <w:szCs w:val="18"/>
+        </w:rPr>
+        <w:t>Which stage of the V-Model typically generates the most bug tickets in a plant watering IoT system?</w:t>
+      </w:r>
+    </w:p>
+    <w:p>
+      <w:pPr>
+        <w:pStyle w:val="NormalWeb"/>
+        <w:numPr>
+          <w:ilvl w:val="0"/>
+          <w:numId w:val="19"/>
+        </w:numPr>
+        <w:rPr>
+          <w:rStyle w:val="Strong"/>
+          <w:rFonts w:ascii="Arial" w:eastAsiaTheme="majorEastAsia" w:hAnsi="Arial" w:cs="Arial"/>
+          <w:b w:val="0"/>
+          <w:bCs w:val="0"/>
+          <w:sz w:val="18"/>
+          <w:szCs w:val="18"/>
+        </w:rPr>
+      </w:pPr>
+      <w:r>
+        <w:rPr>
+          <w:rStyle w:val="Strong"/>
+          <w:rFonts w:ascii="Arial" w:eastAsiaTheme="majorEastAsia" w:hAnsi="Arial" w:cs="Arial"/>
+          <w:b w:val="0"/>
+          <w:bCs w:val="0"/>
+          <w:sz w:val="18"/>
+          <w:szCs w:val="18"/>
+        </w:rPr>
+        <w:t>System testing</w:t>
+      </w:r>
+    </w:p>
+    <w:p>
+      <w:pPr>
+        <w:pStyle w:val="NormalWeb"/>
+        <w:numPr>
+          <w:ilvl w:val="0"/>
+          <w:numId w:val="19"/>
+        </w:numPr>
+        <w:rPr>
+          <w:rStyle w:val="Strong"/>
+          <w:rFonts w:ascii="Arial" w:eastAsiaTheme="majorEastAsia" w:hAnsi="Arial" w:cs="Arial"/>
+          <w:b w:val="0"/>
+          <w:bCs w:val="0"/>
+          <w:sz w:val="18"/>
+          <w:szCs w:val="18"/>
+        </w:rPr>
+      </w:pPr>
+      <w:r>
+        <w:rPr>
+          <w:rStyle w:val="Strong"/>
+          <w:rFonts w:ascii="Arial" w:eastAsiaTheme="majorEastAsia" w:hAnsi="Arial" w:cs="Arial"/>
+          <w:b w:val="0"/>
+          <w:bCs w:val="0"/>
+          <w:sz w:val="18"/>
+          <w:szCs w:val="18"/>
+        </w:rPr>
+        <w:t>Integration testing</w:t>
+      </w:r>
+    </w:p>
+    <w:p>
+      <w:pPr>
+        <w:pStyle w:val="NormalWeb"/>
+        <w:numPr>
+          <w:ilvl w:val="0"/>
+          <w:numId w:val="19"/>
+        </w:numPr>
+        <w:rPr>
+          <w:rStyle w:val="Strong"/>
+          <w:rFonts w:ascii="Arial" w:eastAsiaTheme="majorEastAsia" w:hAnsi="Arial" w:cs="Arial"/>
+          <w:b w:val="0"/>
+          <w:bCs w:val="0"/>
+          <w:sz w:val="18"/>
+          <w:szCs w:val="18"/>
+        </w:rPr>
+      </w:pPr>
+      <w:r>
+        <w:rPr>
+          <w:rStyle w:val="Strong"/>
+          <w:rFonts w:ascii="Arial" w:eastAsiaTheme="majorEastAsia" w:hAnsi="Arial" w:cs="Arial"/>
+          <w:b w:val="0"/>
+          <w:bCs w:val="0"/>
+          <w:sz w:val="18"/>
+          <w:szCs w:val="18"/>
+        </w:rPr>
+        <w:t>Component testing</w:t>
+      </w:r>
+    </w:p>
+    <w:p>
+      <w:pPr>
+        <w:pStyle w:val="NormalWeb"/>
+        <w:numPr>
+          <w:ilvl w:val="0"/>
+          <w:numId w:val="19"/>
+        </w:numPr>
+        <w:rPr>
+          <w:rStyle w:val="Strong"/>
+          <w:rFonts w:ascii="Arial" w:eastAsiaTheme="majorEastAsia" w:hAnsi="Arial" w:cs="Arial"/>
+          <w:b w:val="0"/>
+          <w:bCs w:val="0"/>
+          <w:sz w:val="18"/>
+          <w:szCs w:val="18"/>
+        </w:rPr>
+      </w:pPr>
+      <w:r>
+        <w:rPr>
+          <w:rStyle w:val="Strong"/>
+          <w:rFonts w:ascii="Arial" w:eastAsiaTheme="majorEastAsia" w:hAnsi="Arial" w:cs="Arial"/>
+          <w:b w:val="0"/>
+          <w:bCs w:val="0"/>
+          <w:sz w:val="18"/>
+          <w:szCs w:val="18"/>
+        </w:rPr>
+        <w:t>Unit testing</w:t>
+      </w:r>
+    </w:p>
+    <w:p>
+      <w:pPr>
+        <w:pStyle w:val="NormalWeb"/>
+        <w:numPr>
+          <w:ilvl w:val="0"/>
+          <w:numId w:val="26"/>
+        </w:numPr>
+        <w:rPr>
+          <w:rStyle w:val="Strong"/>
+          <w:rFonts w:ascii="Arial" w:eastAsiaTheme="majorEastAsia" w:hAnsi="Arial" w:cs="Arial"/>
+          <w:sz w:val="18"/>
+          <w:szCs w:val="18"/>
+        </w:rPr>
+      </w:pPr>
+      <w:r>
+        <w:rPr>
+          <w:rStyle w:val="Strong"/>
+          <w:rFonts w:ascii="Arial" w:eastAsiaTheme="majorEastAsia" w:hAnsi="Arial" w:cs="Arial"/>
+          <w:sz w:val="18"/>
+          <w:szCs w:val="18"/>
+        </w:rPr>
+        <w:t xml:space="preserve">How do alpha, beta, and gamma tests relate to </w:t>
+      </w:r>
+      <w:r>
+        <w:rPr>
+          <w:rStyle w:val="Strong"/>
+          <w:rFonts w:ascii="Arial" w:eastAsiaTheme="majorEastAsia" w:hAnsi="Arial" w:cs="Arial"/>
+          <w:sz w:val="18"/>
+          <w:szCs w:val="18"/>
+        </w:rPr>
+        <w:t>V-Model</w:t>
+      </w:r>
+      <w:r>
+        <w:rPr>
+          <w:rStyle w:val="Strong"/>
+          <w:rFonts w:ascii="Arial" w:eastAsiaTheme="majorEastAsia" w:hAnsi="Arial" w:cs="Arial"/>
+          <w:sz w:val="18"/>
+          <w:szCs w:val="18"/>
+        </w:rPr>
+        <w:t xml:space="preserve"> testing?</w:t>
+      </w:r>
+    </w:p>
+    <w:p>
+      <w:pPr>
+        <w:pStyle w:val="NormalWeb"/>
+        <w:numPr>
+          <w:ilvl w:val="0"/>
+          <w:numId w:val="22"/>
+        </w:numPr>
+        <w:rPr>
+          <w:rStyle w:val="Strong"/>
+          <w:rFonts w:ascii="Arial" w:eastAsiaTheme="majorEastAsia" w:hAnsi="Arial" w:cs="Arial"/>
+          <w:b w:val="0"/>
+          <w:bCs w:val="0"/>
+          <w:sz w:val="18"/>
+          <w:szCs w:val="18"/>
+        </w:rPr>
+      </w:pPr>
+      <w:r>
+        <w:rPr>
+          <w:rStyle w:val="Strong"/>
+          <w:rFonts w:ascii="Arial" w:eastAsiaTheme="majorEastAsia" w:hAnsi="Arial" w:cs="Arial"/>
+          <w:b w:val="0"/>
+          <w:bCs w:val="0"/>
+          <w:sz w:val="18"/>
+          <w:szCs w:val="18"/>
+        </w:rPr>
+        <w:t xml:space="preserve">They </w:t>
+      </w:r>
+      <w:r>
+        <w:rPr>
+          <w:rStyle w:val="Strong"/>
+          <w:rFonts w:ascii="Arial" w:eastAsiaTheme="majorEastAsia" w:hAnsi="Arial" w:cs="Arial"/>
+          <w:b w:val="0"/>
+          <w:bCs w:val="0"/>
+          <w:sz w:val="18"/>
+          <w:szCs w:val="18"/>
+        </w:rPr>
+        <w:t>are not required in V-Model, but nice to have</w:t>
+      </w:r>
+    </w:p>
+    <w:p>
+      <w:pPr>
+        <w:pStyle w:val="NormalWeb"/>
+        <w:numPr>
+          <w:ilvl w:val="0"/>
+          <w:numId w:val="22"/>
+        </w:numPr>
+        <w:rPr>
+          <w:rStyle w:val="Strong"/>
+          <w:rFonts w:ascii="Arial" w:eastAsiaTheme="majorEastAsia" w:hAnsi="Arial" w:cs="Arial"/>
+          <w:b w:val="0"/>
+          <w:bCs w:val="0"/>
+          <w:sz w:val="18"/>
+          <w:szCs w:val="18"/>
+        </w:rPr>
+      </w:pPr>
+      <w:r>
+        <w:rPr>
+          <w:rStyle w:val="Strong"/>
+          <w:rFonts w:ascii="Arial" w:eastAsiaTheme="majorEastAsia" w:hAnsi="Arial" w:cs="Arial"/>
+          <w:b w:val="0"/>
+          <w:bCs w:val="0"/>
+          <w:sz w:val="18"/>
+          <w:szCs w:val="18"/>
+        </w:rPr>
+        <w:t>They extend it with real user</w:t>
+      </w:r>
+      <w:r>
+        <w:rPr>
+          <w:rStyle w:val="Strong"/>
+          <w:rFonts w:ascii="Arial" w:eastAsiaTheme="majorEastAsia" w:hAnsi="Arial" w:cs="Arial"/>
+          <w:b w:val="0"/>
+          <w:bCs w:val="0"/>
+          <w:sz w:val="18"/>
+          <w:szCs w:val="18"/>
+        </w:rPr>
+        <w:t xml:space="preserve"> testing</w:t>
+      </w:r>
+    </w:p>
+    <w:p>
+      <w:pPr>
+        <w:pStyle w:val="NormalWeb"/>
+        <w:numPr>
+          <w:ilvl w:val="0"/>
+          <w:numId w:val="22"/>
+        </w:numPr>
+        <w:rPr>
+          <w:rStyle w:val="Strong"/>
+          <w:rFonts w:ascii="Arial" w:eastAsiaTheme="majorEastAsia" w:hAnsi="Arial" w:cs="Arial"/>
+          <w:b w:val="0"/>
+          <w:bCs w:val="0"/>
+          <w:sz w:val="18"/>
+          <w:szCs w:val="18"/>
+        </w:rPr>
+      </w:pPr>
+      <w:r>
+        <w:rPr>
+          <w:rStyle w:val="Strong"/>
+          <w:rFonts w:ascii="Arial" w:eastAsiaTheme="majorEastAsia" w:hAnsi="Arial" w:cs="Arial"/>
+          <w:b w:val="0"/>
+          <w:bCs w:val="0"/>
+          <w:sz w:val="18"/>
+          <w:szCs w:val="18"/>
+        </w:rPr>
+        <w:t xml:space="preserve">They test </w:t>
+      </w:r>
+      <w:r>
+        <w:rPr>
+          <w:rStyle w:val="Strong"/>
+          <w:rFonts w:ascii="Arial" w:eastAsiaTheme="majorEastAsia" w:hAnsi="Arial" w:cs="Arial"/>
+          <w:b w:val="0"/>
+          <w:bCs w:val="0"/>
+          <w:sz w:val="18"/>
+          <w:szCs w:val="18"/>
+        </w:rPr>
+        <w:t xml:space="preserve">software </w:t>
+      </w:r>
+      <w:r>
+        <w:rPr>
+          <w:rStyle w:val="Strong"/>
+          <w:rFonts w:ascii="Arial" w:eastAsiaTheme="majorEastAsia" w:hAnsi="Arial" w:cs="Arial"/>
+          <w:b w:val="0"/>
+          <w:bCs w:val="0"/>
+          <w:sz w:val="18"/>
+          <w:szCs w:val="18"/>
+        </w:rPr>
+        <w:t>hardware</w:t>
+      </w:r>
+      <w:r>
+        <w:rPr>
+          <w:rStyle w:val="Strong"/>
+          <w:rFonts w:ascii="Arial" w:eastAsiaTheme="majorEastAsia" w:hAnsi="Arial" w:cs="Arial"/>
+          <w:b w:val="0"/>
+          <w:bCs w:val="0"/>
+          <w:sz w:val="18"/>
+          <w:szCs w:val="18"/>
+        </w:rPr>
+        <w:t xml:space="preserve"> integration</w:t>
+      </w:r>
+    </w:p>
+    <w:p>
+      <w:pPr>
+        <w:pStyle w:val="NormalWeb"/>
+        <w:numPr>
+          <w:ilvl w:val="0"/>
+          <w:numId w:val="22"/>
+        </w:numPr>
+        <w:rPr>
+          <w:rStyle w:val="Strong"/>
+          <w:rFonts w:ascii="Arial" w:eastAsiaTheme="majorEastAsia" w:hAnsi="Arial" w:cs="Arial"/>
+          <w:sz w:val="18"/>
+          <w:szCs w:val="18"/>
+        </w:rPr>
+      </w:pPr>
+      <w:r>
+        <w:rPr>
+          <w:rStyle w:val="Strong"/>
+          <w:rFonts w:ascii="Arial" w:eastAsiaTheme="majorEastAsia" w:hAnsi="Arial" w:cs="Arial"/>
+          <w:b w:val="0"/>
+          <w:bCs w:val="0"/>
+          <w:sz w:val="18"/>
+          <w:szCs w:val="18"/>
+        </w:rPr>
+        <w:t>They follow failed unit tests</w:t>
+      </w:r>
+    </w:p>
+    <w:p>
+      <w:pPr>
+        <w:pStyle w:val="NormalWeb"/>
+        <w:numPr>
+          <w:ilvl w:val="0"/>
+          <w:numId w:val="26"/>
+        </w:numPr>
         <w:rPr>
           <w:rFonts w:ascii="Arial" w:hAnsi="Arial" w:cs="Arial"/>
           <w:b/>
           <w:bCs/>
           <w:sz w:val="18"/>
           <w:szCs w:val="18"/>
-          <w:highlight w:val="yellow"/>
-        </w:rPr>
-        <w:t>validation</w:t>
-      </w:r>
+        </w:rPr>
+      </w:pPr>
       <w:r>
         <w:rPr>
           <w:rFonts w:ascii="Arial" w:hAnsi="Arial" w:cs="Arial"/>
@@ -686,101 +2337,121 @@
           <w:sz w:val="18"/>
           <w:szCs w:val="18"/>
         </w:rPr>
-        <w:t xml:space="preserve"> fails after implementation, what is the correct next step?</w:t>
-      </w:r>
-    </w:p>
-    <w:p>
-      <w:pPr>
-        <w:pStyle w:val="ListParagraph"/>
-        <w:numPr>
-          <w:ilvl w:val="0"/>
-          <w:numId w:val="2"/>
-        </w:numPr>
-        <w:spacing w:after="240" w:line="240" w:lineRule="auto"/>
-        <w:rPr>
-          <w:rFonts w:ascii="Arial" w:eastAsia="Arial" w:hAnsi="Arial" w:cs="Arial"/>
-          <w:sz w:val="18"/>
-          <w:szCs w:val="18"/>
-        </w:rPr>
-      </w:pPr>
-      <w:r>
-        <w:rPr>
-          <w:rFonts w:ascii="Arial" w:hAnsi="Arial" w:cs="Arial"/>
-          <w:sz w:val="18"/>
-          <w:szCs w:val="18"/>
-        </w:rPr>
-        <w:t>Escalate to design phase</w:t>
-      </w:r>
-    </w:p>
-    <w:p>
-      <w:pPr>
-        <w:pStyle w:val="ListParagraph"/>
-        <w:numPr>
-          <w:ilvl w:val="0"/>
-          <w:numId w:val="2"/>
-        </w:numPr>
-        <w:spacing w:after="240" w:line="240" w:lineRule="auto"/>
-        <w:rPr>
-          <w:rFonts w:ascii="Arial" w:eastAsia="Arial" w:hAnsi="Arial" w:cs="Arial"/>
-          <w:sz w:val="18"/>
-          <w:szCs w:val="18"/>
-          <w:highlight w:val="yellow"/>
-        </w:rPr>
-      </w:pPr>
-      <w:r>
-        <w:rPr>
-          <w:rFonts w:ascii="Arial" w:hAnsi="Arial" w:cs="Arial"/>
-          <w:sz w:val="18"/>
-          <w:szCs w:val="18"/>
-          <w:highlight w:val="yellow"/>
-        </w:rPr>
-        <w:t>Escalate to requirements verification phase</w:t>
-      </w:r>
-    </w:p>
-    <w:p>
-      <w:pPr>
-        <w:pStyle w:val="ListParagraph"/>
-        <w:numPr>
-          <w:ilvl w:val="0"/>
-          <w:numId w:val="2"/>
-        </w:numPr>
-        <w:spacing w:after="240" w:line="240" w:lineRule="auto"/>
-        <w:rPr>
-          <w:rFonts w:ascii="Arial" w:eastAsia="Arial" w:hAnsi="Arial" w:cs="Arial"/>
-          <w:sz w:val="18"/>
-          <w:szCs w:val="18"/>
-        </w:rPr>
-      </w:pPr>
-      <w:r>
-        <w:rPr>
-          <w:rFonts w:ascii="Arial" w:hAnsi="Arial" w:cs="Arial"/>
-          <w:sz w:val="18"/>
-          <w:szCs w:val="18"/>
-        </w:rPr>
-        <w:t>Escalate to system testing phase</w:t>
-      </w:r>
-    </w:p>
-    <w:p>
-      <w:pPr>
-        <w:pStyle w:val="ListParagraph"/>
-        <w:numPr>
-          <w:ilvl w:val="0"/>
-          <w:numId w:val="2"/>
-        </w:numPr>
-        <w:spacing w:after="240" w:line="240" w:lineRule="auto"/>
-        <w:rPr>
-          <w:rFonts w:ascii="Arial" w:eastAsia="Arial" w:hAnsi="Arial" w:cs="Arial"/>
-          <w:sz w:val="18"/>
-          <w:szCs w:val="18"/>
-        </w:rPr>
-      </w:pPr>
-      <w:r>
-        <w:rPr>
-          <w:rFonts w:ascii="Arial" w:hAnsi="Arial" w:cs="Arial"/>
-          <w:sz w:val="18"/>
-          <w:szCs w:val="18"/>
-        </w:rPr>
-        <w:t>Escalate to next development cycle</w:t>
+        <w:t>By integrating Scrum into the V-Model, we can:</w:t>
+      </w:r>
+    </w:p>
+    <w:p>
+      <w:pPr>
+        <w:pStyle w:val="NormalWeb"/>
+        <w:numPr>
+          <w:ilvl w:val="0"/>
+          <w:numId w:val="24"/>
+        </w:numPr>
+        <w:rPr>
+          <w:rFonts w:ascii="Arial" w:hAnsi="Arial" w:cs="Arial"/>
+          <w:sz w:val="18"/>
+          <w:szCs w:val="18"/>
+        </w:rPr>
+      </w:pPr>
+      <w:r>
+        <w:rPr>
+          <w:rFonts w:ascii="Arial" w:hAnsi="Arial" w:cs="Arial"/>
+          <w:sz w:val="18"/>
+          <w:szCs w:val="18"/>
+        </w:rPr>
+        <w:t>Validate</w:t>
+      </w:r>
+      <w:r>
+        <w:rPr>
+          <w:rFonts w:ascii="Arial" w:hAnsi="Arial" w:cs="Arial"/>
+          <w:sz w:val="18"/>
+          <w:szCs w:val="18"/>
+        </w:rPr>
+        <w:t xml:space="preserve"> much</w:t>
+      </w:r>
+      <w:r>
+        <w:rPr>
+          <w:rFonts w:ascii="Arial" w:hAnsi="Arial" w:cs="Arial"/>
+          <w:sz w:val="18"/>
+          <w:szCs w:val="18"/>
+        </w:rPr>
+        <w:t xml:space="preserve"> earlier</w:t>
+      </w:r>
+    </w:p>
+    <w:p>
+      <w:pPr>
+        <w:pStyle w:val="NormalWeb"/>
+        <w:numPr>
+          <w:ilvl w:val="0"/>
+          <w:numId w:val="24"/>
+        </w:numPr>
+        <w:rPr>
+          <w:rFonts w:ascii="Arial" w:hAnsi="Arial" w:cs="Arial"/>
+          <w:sz w:val="18"/>
+          <w:szCs w:val="18"/>
+        </w:rPr>
+      </w:pPr>
+      <w:r>
+        <w:rPr>
+          <w:rFonts w:ascii="Arial" w:hAnsi="Arial" w:cs="Arial"/>
+          <w:sz w:val="18"/>
+          <w:szCs w:val="18"/>
+        </w:rPr>
+        <w:t>Verify</w:t>
+      </w:r>
+      <w:r>
+        <w:rPr>
+          <w:rFonts w:ascii="Arial" w:hAnsi="Arial" w:cs="Arial"/>
+          <w:sz w:val="18"/>
+          <w:szCs w:val="18"/>
+        </w:rPr>
+        <w:t xml:space="preserve"> much</w:t>
+      </w:r>
+      <w:r>
+        <w:rPr>
+          <w:rFonts w:ascii="Arial" w:hAnsi="Arial" w:cs="Arial"/>
+          <w:sz w:val="18"/>
+          <w:szCs w:val="18"/>
+        </w:rPr>
+        <w:t xml:space="preserve"> earlier</w:t>
+      </w:r>
+    </w:p>
+    <w:p>
+      <w:pPr>
+        <w:pStyle w:val="NormalWeb"/>
+        <w:numPr>
+          <w:ilvl w:val="0"/>
+          <w:numId w:val="24"/>
+        </w:numPr>
+        <w:rPr>
+          <w:rFonts w:ascii="Arial" w:hAnsi="Arial" w:cs="Arial"/>
+          <w:sz w:val="18"/>
+          <w:szCs w:val="18"/>
+        </w:rPr>
+      </w:pPr>
+      <w:r>
+        <w:rPr>
+          <w:rFonts w:ascii="Arial" w:hAnsi="Arial" w:cs="Arial"/>
+          <w:sz w:val="18"/>
+          <w:szCs w:val="18"/>
+        </w:rPr>
+        <w:t xml:space="preserve">Test </w:t>
+      </w:r>
+      <w:r>
+        <w:rPr>
+          <w:rFonts w:ascii="Arial" w:hAnsi="Arial" w:cs="Arial"/>
+          <w:sz w:val="18"/>
+          <w:szCs w:val="18"/>
+        </w:rPr>
+        <w:t xml:space="preserve">much </w:t>
+      </w:r>
+      <w:r>
+        <w:rPr>
+          <w:rFonts w:ascii="Arial" w:hAnsi="Arial" w:cs="Arial"/>
+          <w:sz w:val="18"/>
+          <w:szCs w:val="18"/>
+        </w:rPr>
+        <w:t>earlier</w:t>
       </w:r>
     </w:p>
     <w:p>
@@ -791,28 +2462,288 @@
           <w:numId w:val="26"/>
         </w:numPr>
         <w:rPr>
-          <w:rStyle w:val="Strong"/>
-          <w:rFonts w:ascii="Arial" w:eastAsiaTheme="majorEastAsia" w:hAnsi="Arial" w:cs="Arial"/>
-          <w:sz w:val="18"/>
-          <w:szCs w:val="18"/>
-        </w:rPr>
-      </w:pPr>
-      <w:r>
-        <w:rPr>
-          <w:rStyle w:val="Strong"/>
-          <w:rFonts w:ascii="Arial" w:eastAsiaTheme="majorEastAsia" w:hAnsi="Arial" w:cs="Arial"/>
-          <w:sz w:val="18"/>
-          <w:szCs w:val="18"/>
-        </w:rPr>
-        <w:t>In the V-Model, if architecture verification fails in a plant watering IoT system, what should happen next?</w:t>
-      </w:r>
-    </w:p>
-    <w:p>
-      <w:pPr>
-        <w:pStyle w:val="NormalWeb"/>
-        <w:numPr>
-          <w:ilvl w:val="0"/>
-          <w:numId w:val="12"/>
+          <w:rFonts w:ascii="Arial" w:hAnsi="Arial" w:cs="Arial"/>
+          <w:b/>
+          <w:bCs/>
+          <w:sz w:val="18"/>
+          <w:szCs w:val="18"/>
+        </w:rPr>
+      </w:pPr>
+      <w:r>
+        <w:rPr>
+          <w:rFonts w:ascii="Arial" w:hAnsi="Arial" w:cs="Arial"/>
+          <w:b/>
+          <w:bCs/>
+          <w:sz w:val="18"/>
+          <w:szCs w:val="18"/>
+        </w:rPr>
+        <w:t>Which level of testing in the V-Model is usually the most difficult to fix if issues are found?</w:t>
+      </w:r>
+    </w:p>
+    <w:p>
+      <w:pPr>
+        <w:pStyle w:val="NormalWeb"/>
+        <w:numPr>
+          <w:ilvl w:val="0"/>
+          <w:numId w:val="23"/>
+        </w:numPr>
+        <w:rPr>
+          <w:rFonts w:ascii="Arial" w:hAnsi="Arial" w:cs="Arial"/>
+          <w:sz w:val="18"/>
+          <w:szCs w:val="18"/>
+        </w:rPr>
+      </w:pPr>
+      <w:r>
+        <w:rPr>
+          <w:rFonts w:ascii="Arial" w:hAnsi="Arial" w:cs="Arial"/>
+          <w:sz w:val="18"/>
+          <w:szCs w:val="18"/>
+        </w:rPr>
+        <w:t>Unit testing</w:t>
+      </w:r>
+    </w:p>
+    <w:p>
+      <w:pPr>
+        <w:pStyle w:val="NormalWeb"/>
+        <w:numPr>
+          <w:ilvl w:val="0"/>
+          <w:numId w:val="23"/>
+        </w:numPr>
+        <w:rPr>
+          <w:rFonts w:ascii="Arial" w:hAnsi="Arial" w:cs="Arial"/>
+          <w:sz w:val="18"/>
+          <w:szCs w:val="18"/>
+        </w:rPr>
+      </w:pPr>
+      <w:r>
+        <w:rPr>
+          <w:rFonts w:ascii="Arial" w:hAnsi="Arial" w:cs="Arial"/>
+          <w:sz w:val="18"/>
+          <w:szCs w:val="18"/>
+        </w:rPr>
+        <w:t>Component testing</w:t>
+      </w:r>
+    </w:p>
+    <w:p>
+      <w:pPr>
+        <w:pStyle w:val="NormalWeb"/>
+        <w:numPr>
+          <w:ilvl w:val="0"/>
+          <w:numId w:val="23"/>
+        </w:numPr>
+        <w:rPr>
+          <w:rFonts w:ascii="Arial" w:hAnsi="Arial" w:cs="Arial"/>
+          <w:sz w:val="18"/>
+          <w:szCs w:val="18"/>
+        </w:rPr>
+      </w:pPr>
+      <w:r>
+        <w:rPr>
+          <w:rFonts w:ascii="Arial" w:hAnsi="Arial" w:cs="Arial"/>
+          <w:sz w:val="18"/>
+          <w:szCs w:val="18"/>
+        </w:rPr>
+        <w:t>Integration testing</w:t>
+      </w:r>
+    </w:p>
+    <w:p>
+      <w:pPr>
+        <w:pStyle w:val="NormalWeb"/>
+        <w:numPr>
+          <w:ilvl w:val="0"/>
+          <w:numId w:val="23"/>
+        </w:numPr>
+        <w:rPr>
+          <w:rFonts w:ascii="Arial" w:hAnsi="Arial" w:cs="Arial"/>
+          <w:b/>
+          <w:bCs/>
+          <w:sz w:val="18"/>
+          <w:szCs w:val="18"/>
+        </w:rPr>
+      </w:pPr>
+      <w:r>
+        <w:rPr>
+          <w:rFonts w:ascii="Arial" w:hAnsi="Arial" w:cs="Arial"/>
+          <w:sz w:val="18"/>
+          <w:szCs w:val="18"/>
+        </w:rPr>
+        <w:t>System testing</w:t>
+      </w:r>
+    </w:p>
+    <w:p>
+      <w:pPr>
+        <w:pStyle w:val="NormalWeb"/>
+        <w:numPr>
+          <w:ilvl w:val="0"/>
+          <w:numId w:val="26"/>
+        </w:numPr>
+        <w:rPr>
+          <w:rFonts w:ascii="Arial" w:hAnsi="Arial" w:cs="Arial"/>
+          <w:b/>
+          <w:bCs/>
+          <w:sz w:val="18"/>
+          <w:szCs w:val="18"/>
+        </w:rPr>
+      </w:pPr>
+      <w:r>
+        <w:rPr>
+          <w:rFonts w:ascii="Arial" w:hAnsi="Arial" w:cs="Arial"/>
+          <w:b/>
+          <w:bCs/>
+          <w:sz w:val="18"/>
+          <w:szCs w:val="18"/>
+        </w:rPr>
+        <w:t>W</w:t>
+      </w:r>
+      <w:r>
+        <w:rPr>
+          <w:rFonts w:ascii="Arial" w:hAnsi="Arial" w:cs="Arial"/>
+          <w:b/>
+          <w:bCs/>
+          <w:sz w:val="18"/>
+          <w:szCs w:val="18"/>
+        </w:rPr>
+        <w:t xml:space="preserve">hich part of plant watering system </w:t>
+      </w:r>
+      <w:r>
+        <w:rPr>
+          <w:rFonts w:ascii="Arial" w:hAnsi="Arial" w:cs="Arial"/>
+          <w:b/>
+          <w:bCs/>
+          <w:sz w:val="18"/>
+          <w:szCs w:val="18"/>
+        </w:rPr>
+        <w:t>fits</w:t>
+      </w:r>
+      <w:r>
+        <w:rPr>
+          <w:rFonts w:ascii="Arial" w:hAnsi="Arial" w:cs="Arial"/>
+          <w:b/>
+          <w:bCs/>
+          <w:sz w:val="18"/>
+          <w:szCs w:val="18"/>
+        </w:rPr>
+        <w:t xml:space="preserve"> user-based access control?</w:t>
+      </w:r>
+    </w:p>
+    <w:p>
+      <w:pPr>
+        <w:pStyle w:val="NormalWeb"/>
+        <w:numPr>
+          <w:ilvl w:val="0"/>
+          <w:numId w:val="20"/>
+        </w:numPr>
+        <w:rPr>
+          <w:rFonts w:ascii="Arial" w:hAnsi="Arial" w:cs="Arial"/>
+          <w:sz w:val="18"/>
+          <w:szCs w:val="18"/>
+        </w:rPr>
+      </w:pPr>
+      <w:r>
+        <w:rPr>
+          <w:rFonts w:ascii="Arial" w:hAnsi="Arial" w:cs="Arial"/>
+          <w:sz w:val="18"/>
+          <w:szCs w:val="18"/>
+        </w:rPr>
+        <w:t>Embedded</w:t>
+      </w:r>
+    </w:p>
+    <w:p>
+      <w:pPr>
+        <w:pStyle w:val="NormalWeb"/>
+        <w:numPr>
+          <w:ilvl w:val="0"/>
+          <w:numId w:val="20"/>
+        </w:numPr>
+        <w:rPr>
+          <w:rFonts w:ascii="Arial" w:hAnsi="Arial" w:cs="Arial"/>
+          <w:sz w:val="18"/>
+          <w:szCs w:val="18"/>
+        </w:rPr>
+      </w:pPr>
+      <w:r>
+        <w:rPr>
+          <w:rFonts w:ascii="Arial" w:hAnsi="Arial" w:cs="Arial"/>
+          <w:sz w:val="18"/>
+          <w:szCs w:val="18"/>
+        </w:rPr>
+        <w:t>Backend</w:t>
+      </w:r>
+    </w:p>
+    <w:p>
+      <w:pPr>
+        <w:pStyle w:val="NormalWeb"/>
+        <w:numPr>
+          <w:ilvl w:val="0"/>
+          <w:numId w:val="20"/>
+        </w:numPr>
+        <w:rPr>
+          <w:rFonts w:ascii="Arial" w:hAnsi="Arial" w:cs="Arial"/>
+          <w:sz w:val="18"/>
+          <w:szCs w:val="18"/>
+        </w:rPr>
+      </w:pPr>
+      <w:r>
+        <w:rPr>
+          <w:rFonts w:ascii="Arial" w:hAnsi="Arial" w:cs="Arial"/>
+          <w:sz w:val="18"/>
+          <w:szCs w:val="18"/>
+        </w:rPr>
+        <w:t>Database</w:t>
+      </w:r>
+    </w:p>
+    <w:p>
+      <w:pPr>
+        <w:pStyle w:val="NormalWeb"/>
+        <w:numPr>
+          <w:ilvl w:val="0"/>
+          <w:numId w:val="20"/>
+        </w:numPr>
+        <w:rPr>
+          <w:rFonts w:ascii="Arial" w:hAnsi="Arial" w:cs="Arial"/>
+          <w:sz w:val="18"/>
+          <w:szCs w:val="18"/>
+        </w:rPr>
+      </w:pPr>
+      <w:r>
+        <w:rPr>
+          <w:rFonts w:ascii="Arial" w:hAnsi="Arial" w:cs="Arial"/>
+          <w:sz w:val="18"/>
+          <w:szCs w:val="18"/>
+        </w:rPr>
+        <w:t>Frontend</w:t>
+      </w:r>
+    </w:p>
+    <w:p>
+      <w:pPr>
+        <w:pStyle w:val="NormalWeb"/>
+        <w:numPr>
+          <w:ilvl w:val="0"/>
+          <w:numId w:val="26"/>
+        </w:numPr>
+        <w:rPr>
+          <w:rStyle w:val="Strong"/>
+          <w:rFonts w:ascii="Arial" w:eastAsiaTheme="majorEastAsia" w:hAnsi="Arial" w:cs="Arial"/>
+          <w:sz w:val="18"/>
+          <w:szCs w:val="18"/>
+        </w:rPr>
+      </w:pPr>
+      <w:r>
+        <w:rPr>
+          <w:rStyle w:val="Strong"/>
+          <w:rFonts w:ascii="Arial" w:eastAsiaTheme="majorEastAsia" w:hAnsi="Arial" w:cs="Arial"/>
+          <w:sz w:val="18"/>
+          <w:szCs w:val="18"/>
+        </w:rPr>
+        <w:t>How can you ensure that the plant water sensor is providing accurate data over time?</w:t>
+      </w:r>
+    </w:p>
+    <w:p>
+      <w:pPr>
+        <w:pStyle w:val="NormalWeb"/>
+        <w:numPr>
+          <w:ilvl w:val="0"/>
+          <w:numId w:val="16"/>
         </w:numPr>
         <w:rPr>
           <w:rStyle w:val="Strong"/>
@@ -832,15 +2763,15 @@
           <w:sz w:val="18"/>
           <w:szCs w:val="18"/>
         </w:rPr>
-        <w:t>Move to coding anyway</w:t>
-      </w:r>
-    </w:p>
-    <w:p>
-      <w:pPr>
-        <w:pStyle w:val="NormalWeb"/>
-        <w:numPr>
-          <w:ilvl w:val="0"/>
-          <w:numId w:val="12"/>
+        <w:t>By running periodic calibration checks against a known reference</w:t>
+      </w:r>
+    </w:p>
+    <w:p>
+      <w:pPr>
+        <w:pStyle w:val="NormalWeb"/>
+        <w:numPr>
+          <w:ilvl w:val="0"/>
+          <w:numId w:val="16"/>
         </w:numPr>
         <w:rPr>
           <w:rStyle w:val="Strong"/>
@@ -849,7 +2780,6 @@
           <w:bCs w:val="0"/>
           <w:sz w:val="18"/>
           <w:szCs w:val="18"/>
-          <w:highlight w:val="yellow"/>
         </w:rPr>
       </w:pPr>
       <w:r>
@@ -860,17 +2790,16 @@
           <w:bCs w:val="0"/>
           <w:sz w:val="18"/>
           <w:szCs w:val="18"/>
-          <w:highlight w:val="yellow"/>
-        </w:rPr>
-        <w:t>Return to system design</w:t>
-      </w:r>
-    </w:p>
-    <w:p>
-      <w:pPr>
-        <w:pStyle w:val="NormalWeb"/>
-        <w:numPr>
-          <w:ilvl w:val="0"/>
-          <w:numId w:val="12"/>
+        </w:rPr>
+        <w:t>By assuming the sensor will maintain accuracy without testing</w:t>
+      </w:r>
+    </w:p>
+    <w:p>
+      <w:pPr>
+        <w:pStyle w:val="NormalWeb"/>
+        <w:numPr>
+          <w:ilvl w:val="0"/>
+          <w:numId w:val="16"/>
         </w:numPr>
         <w:rPr>
           <w:rStyle w:val="Strong"/>
@@ -890,26 +2819,65 @@
           <w:sz w:val="18"/>
           <w:szCs w:val="18"/>
         </w:rPr>
-        <w:t>Start integration testing</w:t>
-      </w:r>
-    </w:p>
-    <w:p>
-      <w:pPr>
-        <w:pStyle w:val="NormalWeb"/>
-        <w:numPr>
-          <w:ilvl w:val="0"/>
-          <w:numId w:val="12"/>
-        </w:numPr>
-        <w:rPr>
-          <w:rStyle w:val="Strong"/>
-          <w:rFonts w:ascii="Arial" w:hAnsi="Arial" w:cs="Arial"/>
+        <w:t>By testing the sensor only during the initial installation</w:t>
+      </w:r>
+    </w:p>
+    <w:p>
+      <w:pPr>
+        <w:pStyle w:val="NormalWeb"/>
+        <w:numPr>
+          <w:ilvl w:val="0"/>
+          <w:numId w:val="16"/>
+        </w:numPr>
+        <w:rPr>
+          <w:rFonts w:ascii="Arial" w:eastAsiaTheme="majorEastAsia" w:hAnsi="Arial" w:cs="Arial"/>
+          <w:sz w:val="18"/>
+          <w:szCs w:val="18"/>
+        </w:rPr>
+      </w:pPr>
+      <w:r>
+        <w:rPr>
+          <w:rStyle w:val="Strong"/>
+          <w:rFonts w:ascii="Arial" w:eastAsiaTheme="majorEastAsia" w:hAnsi="Arial" w:cs="Arial"/>
           <w:b w:val="0"/>
           <w:bCs w:val="0"/>
           <w:sz w:val="18"/>
           <w:szCs w:val="18"/>
         </w:rPr>
-      </w:pPr>
-      <w:r>
+        <w:t>By monitoring the system for sensor errors after deployment</w:t>
+      </w:r>
+    </w:p>
+    <w:p>
+      <w:pPr>
+        <w:pStyle w:val="NormalWeb"/>
+        <w:numPr>
+          <w:ilvl w:val="0"/>
+          <w:numId w:val="26"/>
+        </w:numPr>
+        <w:rPr>
+          <w:rStyle w:val="Strong"/>
+          <w:rFonts w:ascii="Arial" w:eastAsiaTheme="majorEastAsia" w:hAnsi="Arial" w:cs="Arial"/>
+          <w:sz w:val="18"/>
+          <w:szCs w:val="18"/>
+        </w:rPr>
+      </w:pPr>
+      <w:r>
+        <w:rPr>
+          <w:rStyle w:val="Strong"/>
+          <w:rFonts w:ascii="Arial" w:eastAsiaTheme="majorEastAsia" w:hAnsi="Arial" w:cs="Arial"/>
+          <w:sz w:val="18"/>
+          <w:szCs w:val="18"/>
+        </w:rPr>
+        <w:t>How can you optimize battery life in embedded devices used for a plant watering IoT system?</w:t>
+      </w:r>
+    </w:p>
+    <w:p>
+      <w:pPr>
+        <w:pStyle w:val="NormalWeb"/>
+        <w:numPr>
+          <w:ilvl w:val="0"/>
+          <w:numId w:val="17"/>
+        </w:numPr>
         <w:rPr>
           <w:rStyle w:val="Strong"/>
           <w:rFonts w:ascii="Arial" w:eastAsiaTheme="majorEastAsia" w:hAnsi="Arial" w:cs="Arial"/>
@@ -918,83 +2886,8 @@
           <w:sz w:val="18"/>
           <w:szCs w:val="18"/>
         </w:rPr>
-        <w:t>Update unit test cases</w:t>
-      </w:r>
-    </w:p>
-    <w:p>
-      <w:pPr>
-        <w:pStyle w:val="NormalWeb"/>
-        <w:ind w:left="360"/>
-        <w:rPr>
-          <w:rStyle w:val="Strong"/>
-          <w:rFonts w:ascii="Arial" w:eastAsiaTheme="majorEastAsia" w:hAnsi="Arial" w:cs="Arial"/>
-          <w:sz w:val="18"/>
-          <w:szCs w:val="18"/>
-        </w:rPr>
-      </w:pPr>
-    </w:p>
-    <w:p>
-      <w:pPr>
-        <w:pStyle w:val="NormalWeb"/>
-        <w:ind w:left="360"/>
-        <w:rPr>
-          <w:rStyle w:val="Strong"/>
-          <w:rFonts w:ascii="Arial" w:eastAsiaTheme="majorEastAsia" w:hAnsi="Arial" w:cs="Arial"/>
-          <w:sz w:val="18"/>
-          <w:szCs w:val="18"/>
-        </w:rPr>
-      </w:pPr>
-    </w:p>
-    <w:p>
-      <w:pPr>
-        <w:pStyle w:val="NormalWeb"/>
-        <w:numPr>
-          <w:ilvl w:val="0"/>
-          <w:numId w:val="26"/>
-        </w:numPr>
-        <w:rPr>
-          <w:rStyle w:val="Strong"/>
-          <w:rFonts w:ascii="Arial" w:eastAsiaTheme="majorEastAsia" w:hAnsi="Arial" w:cs="Arial"/>
-          <w:sz w:val="18"/>
-          <w:szCs w:val="18"/>
-        </w:rPr>
-      </w:pPr>
-      <w:r>
-        <w:rPr>
-          <w:rStyle w:val="Strong"/>
-          <w:rFonts w:ascii="Arial" w:eastAsiaTheme="majorEastAsia" w:hAnsi="Arial" w:cs="Arial"/>
-          <w:sz w:val="18"/>
-          <w:szCs w:val="18"/>
-        </w:rPr>
-        <w:t xml:space="preserve">Why </w:t>
-      </w:r>
-      <w:r>
-        <w:rPr>
-          <w:rStyle w:val="Strong"/>
-          <w:rFonts w:ascii="Arial" w:eastAsiaTheme="majorEastAsia" w:hAnsi="Arial" w:cs="Arial"/>
-          <w:sz w:val="18"/>
-          <w:szCs w:val="18"/>
-          <w:highlight w:val="yellow"/>
-        </w:rPr>
-        <w:t>can’t</w:t>
-      </w:r>
-      <w:r>
-        <w:rPr>
-          <w:rStyle w:val="Strong"/>
-          <w:rFonts w:ascii="Arial" w:eastAsiaTheme="majorEastAsia" w:hAnsi="Arial" w:cs="Arial"/>
-          <w:sz w:val="18"/>
-          <w:szCs w:val="18"/>
-        </w:rPr>
-        <w:t xml:space="preserve"> the backlogs for Agile and V-Model be the same in a plant watering IoT system project?</w:t>
-      </w:r>
-    </w:p>
-    <w:p>
-      <w:pPr>
-        <w:pStyle w:val="NormalWeb"/>
-        <w:numPr>
-          <w:ilvl w:val="0"/>
-          <w:numId w:val="13"/>
-        </w:numPr>
+      </w:pPr>
+      <w:r>
         <w:rPr>
           <w:rStyle w:val="Strong"/>
           <w:rFonts w:ascii="Arial" w:eastAsiaTheme="majorEastAsia" w:hAnsi="Arial" w:cs="Arial"/>
@@ -1003,8 +2896,16 @@
           <w:sz w:val="18"/>
           <w:szCs w:val="18"/>
         </w:rPr>
-      </w:pPr>
-      <w:r>
+        <w:t>By using high-power sensors for continuous data collection</w:t>
+      </w:r>
+    </w:p>
+    <w:p>
+      <w:pPr>
+        <w:pStyle w:val="NormalWeb"/>
+        <w:numPr>
+          <w:ilvl w:val="0"/>
+          <w:numId w:val="17"/>
+        </w:numPr>
         <w:rPr>
           <w:rStyle w:val="Strong"/>
           <w:rFonts w:ascii="Arial" w:eastAsiaTheme="majorEastAsia" w:hAnsi="Arial" w:cs="Arial"/>
@@ -1013,16 +2914,8 @@
           <w:sz w:val="18"/>
           <w:szCs w:val="18"/>
         </w:rPr>
-        <w:t>Agile doesn’t define backlog items, but V-Model does</w:t>
-      </w:r>
-    </w:p>
-    <w:p>
-      <w:pPr>
-        <w:pStyle w:val="NormalWeb"/>
-        <w:numPr>
-          <w:ilvl w:val="0"/>
-          <w:numId w:val="13"/>
-        </w:numPr>
+      </w:pPr>
+      <w:r>
         <w:rPr>
           <w:rStyle w:val="Strong"/>
           <w:rFonts w:ascii="Arial" w:eastAsiaTheme="majorEastAsia" w:hAnsi="Arial" w:cs="Arial"/>
@@ -1030,10 +2923,17 @@
           <w:bCs w:val="0"/>
           <w:sz w:val="18"/>
           <w:szCs w:val="18"/>
-          <w:highlight w:val="yellow"/>
-        </w:rPr>
-      </w:pPr>
-      <w:r>
+        </w:rPr>
+        <w:t>By optimizing software to reduce processing and communication frequency</w:t>
+      </w:r>
+    </w:p>
+    <w:p>
+      <w:pPr>
+        <w:pStyle w:val="NormalWeb"/>
+        <w:numPr>
+          <w:ilvl w:val="0"/>
+          <w:numId w:val="17"/>
+        </w:numPr>
         <w:rPr>
           <w:rStyle w:val="Strong"/>
           <w:rFonts w:ascii="Arial" w:eastAsiaTheme="majorEastAsia" w:hAnsi="Arial" w:cs="Arial"/>
@@ -1041,18 +2941,9 @@
           <w:bCs w:val="0"/>
           <w:sz w:val="18"/>
           <w:szCs w:val="18"/>
-          <w:highlight w:val="yellow"/>
-        </w:rPr>
-        <w:t>The V-Model backlog is static, while Agile requires flexibility</w:t>
-      </w:r>
-    </w:p>
-    <w:p>
-      <w:pPr>
-        <w:pStyle w:val="NormalWeb"/>
-        <w:numPr>
-          <w:ilvl w:val="0"/>
-          <w:numId w:val="13"/>
-        </w:numPr>
+        </w:rPr>
+      </w:pPr>
+      <w:r>
         <w:rPr>
           <w:rStyle w:val="Strong"/>
           <w:rFonts w:ascii="Arial" w:eastAsiaTheme="majorEastAsia" w:hAnsi="Arial" w:cs="Arial"/>
@@ -1061,32 +2952,24 @@
           <w:sz w:val="18"/>
           <w:szCs w:val="18"/>
         </w:rPr>
-      </w:pPr>
-      <w:r>
-        <w:rPr>
-          <w:rStyle w:val="Strong"/>
-          <w:rFonts w:ascii="Arial" w:eastAsiaTheme="majorEastAsia" w:hAnsi="Arial" w:cs="Arial"/>
+        <w:t>By increasing the sensor's transmission range to collect more data</w:t>
+      </w:r>
+    </w:p>
+    <w:p>
+      <w:pPr>
+        <w:pStyle w:val="NormalWeb"/>
+        <w:numPr>
+          <w:ilvl w:val="0"/>
+          <w:numId w:val="17"/>
+        </w:numPr>
+        <w:rPr>
+          <w:rStyle w:val="Strong"/>
+          <w:rFonts w:ascii="Arial" w:hAnsi="Arial" w:cs="Arial"/>
           <w:b w:val="0"/>
           <w:bCs w:val="0"/>
           <w:sz w:val="18"/>
           <w:szCs w:val="18"/>
         </w:rPr>
-        <w:t>Agile backlogs are only for UI tasks, while the V-Model backlog focuses on testing</w:t>
-      </w:r>
-    </w:p>
-    <w:p>
-      <w:pPr>
-        <w:pStyle w:val="NormalWeb"/>
-        <w:numPr>
-          <w:ilvl w:val="0"/>
-          <w:numId w:val="13"/>
-        </w:numPr>
-        <w:rPr>
-          <w:rFonts w:ascii="Arial" w:eastAsia="Arial" w:hAnsi="Arial" w:cs="Arial"/>
-          <w:sz w:val="18"/>
-          <w:szCs w:val="18"/>
-          <w:highlight w:val="yellow"/>
-        </w:rPr>
       </w:pPr>
       <w:r>
         <w:rPr>
@@ -1096,1341 +2979,13 @@
           <w:bCs w:val="0"/>
           <w:sz w:val="18"/>
           <w:szCs w:val="18"/>
-          <w:highlight w:val="yellow"/>
-        </w:rPr>
-        <w:t>V-Model backlogs are predefined at the start, while Agile evolves over time</w:t>
-      </w:r>
-    </w:p>
-    <w:p>
-      <w:pPr>
-        <w:pStyle w:val="NormalWeb"/>
-        <w:numPr>
-          <w:ilvl w:val="0"/>
-          <w:numId w:val="26"/>
-        </w:numPr>
-        <w:rPr>
-          <w:rStyle w:val="Strong"/>
-          <w:rFonts w:ascii="Arial" w:eastAsiaTheme="majorEastAsia" w:hAnsi="Arial" w:cs="Arial"/>
-          <w:sz w:val="18"/>
-          <w:szCs w:val="18"/>
-        </w:rPr>
-      </w:pPr>
-      <w:r>
-        <w:rPr>
-          <w:rStyle w:val="Strong"/>
-          <w:rFonts w:ascii="Arial" w:eastAsiaTheme="majorEastAsia" w:hAnsi="Arial" w:cs="Arial"/>
-          <w:sz w:val="18"/>
-          <w:szCs w:val="18"/>
-        </w:rPr>
-        <w:t>Which phase of the V-Model for a plant watering IoT system typically requires the most incremental steps?</w:t>
-      </w:r>
-    </w:p>
-    <w:p>
-      <w:pPr>
-        <w:pStyle w:val="NormalWeb"/>
-        <w:numPr>
-          <w:ilvl w:val="0"/>
-          <w:numId w:val="14"/>
-        </w:numPr>
-        <w:rPr>
-          <w:rStyle w:val="Strong"/>
-          <w:rFonts w:ascii="Arial" w:eastAsiaTheme="majorEastAsia" w:hAnsi="Arial" w:cs="Arial"/>
-          <w:b w:val="0"/>
-          <w:bCs w:val="0"/>
-          <w:sz w:val="18"/>
-          <w:szCs w:val="18"/>
-        </w:rPr>
-      </w:pPr>
-      <w:r>
-        <w:rPr>
-          <w:rStyle w:val="Strong"/>
-          <w:rFonts w:ascii="Arial" w:eastAsiaTheme="majorEastAsia" w:hAnsi="Arial" w:cs="Arial"/>
-          <w:b w:val="0"/>
-          <w:bCs w:val="0"/>
-          <w:sz w:val="18"/>
-          <w:szCs w:val="18"/>
-        </w:rPr>
-        <w:t>Requirement’s analysis</w:t>
-      </w:r>
-    </w:p>
-    <w:p>
-      <w:pPr>
-        <w:pStyle w:val="NormalWeb"/>
-        <w:numPr>
-          <w:ilvl w:val="0"/>
-          <w:numId w:val="14"/>
-        </w:numPr>
-        <w:rPr>
-          <w:rStyle w:val="Strong"/>
-          <w:rFonts w:ascii="Arial" w:eastAsiaTheme="majorEastAsia" w:hAnsi="Arial" w:cs="Arial"/>
-          <w:b w:val="0"/>
-          <w:bCs w:val="0"/>
-          <w:sz w:val="18"/>
-          <w:szCs w:val="18"/>
-        </w:rPr>
-      </w:pPr>
-      <w:r>
-        <w:rPr>
-          <w:rStyle w:val="Strong"/>
-          <w:rFonts w:ascii="Arial" w:eastAsiaTheme="majorEastAsia" w:hAnsi="Arial" w:cs="Arial"/>
-          <w:b w:val="0"/>
-          <w:bCs w:val="0"/>
-          <w:sz w:val="18"/>
-          <w:szCs w:val="18"/>
-        </w:rPr>
-        <w:t>System design</w:t>
-      </w:r>
-    </w:p>
-    <w:p>
-      <w:pPr>
-        <w:pStyle w:val="NormalWeb"/>
-        <w:numPr>
-          <w:ilvl w:val="0"/>
-          <w:numId w:val="14"/>
-        </w:numPr>
-        <w:rPr>
-          <w:rStyle w:val="Strong"/>
-          <w:rFonts w:ascii="Arial" w:eastAsiaTheme="majorEastAsia" w:hAnsi="Arial" w:cs="Arial"/>
-          <w:b w:val="0"/>
-          <w:bCs w:val="0"/>
-          <w:sz w:val="18"/>
-          <w:szCs w:val="18"/>
-          <w:highlight w:val="yellow"/>
-        </w:rPr>
-      </w:pPr>
-      <w:r>
-        <w:rPr>
-          <w:rStyle w:val="Strong"/>
-          <w:rFonts w:ascii="Arial" w:eastAsiaTheme="majorEastAsia" w:hAnsi="Arial" w:cs="Arial"/>
-          <w:b w:val="0"/>
-          <w:bCs w:val="0"/>
-          <w:sz w:val="18"/>
-          <w:szCs w:val="18"/>
-          <w:highlight w:val="yellow"/>
-        </w:rPr>
-        <w:t>Testing and validation</w:t>
-      </w:r>
-    </w:p>
-    <w:p>
-      <w:pPr>
-        <w:pStyle w:val="NormalWeb"/>
-        <w:numPr>
-          <w:ilvl w:val="0"/>
-          <w:numId w:val="14"/>
-        </w:numPr>
-        <w:rPr>
-          <w:rFonts w:ascii="Arial" w:hAnsi="Arial" w:cs="Arial"/>
-          <w:sz w:val="18"/>
-          <w:szCs w:val="18"/>
-        </w:rPr>
-      </w:pPr>
-      <w:r>
-        <w:rPr>
-          <w:rStyle w:val="Strong"/>
-          <w:rFonts w:ascii="Arial" w:eastAsiaTheme="majorEastAsia" w:hAnsi="Arial" w:cs="Arial"/>
-          <w:b w:val="0"/>
-          <w:bCs w:val="0"/>
-          <w:sz w:val="18"/>
-          <w:szCs w:val="18"/>
-        </w:rPr>
-        <w:t>Deployment</w:t>
-      </w:r>
-    </w:p>
-    <w:p>
-      <w:pPr>
-        <w:pStyle w:val="NormalWeb"/>
-        <w:numPr>
-          <w:ilvl w:val="0"/>
-          <w:numId w:val="26"/>
-        </w:numPr>
-        <w:rPr>
-          <w:rStyle w:val="Strong"/>
-          <w:rFonts w:ascii="Arial" w:eastAsiaTheme="majorEastAsia" w:hAnsi="Arial" w:cs="Arial"/>
-          <w:sz w:val="18"/>
-          <w:szCs w:val="18"/>
-        </w:rPr>
-      </w:pPr>
-      <w:r>
-        <w:rPr>
-          <w:rStyle w:val="Strong"/>
-          <w:rFonts w:ascii="Arial" w:eastAsiaTheme="majorEastAsia" w:hAnsi="Arial" w:cs="Arial"/>
-          <w:sz w:val="18"/>
-          <w:szCs w:val="18"/>
-        </w:rPr>
-        <w:t>How does the architecture of the plant watering IoT system affect the scalability of development teams?</w:t>
-      </w:r>
-    </w:p>
-    <w:p>
-      <w:pPr>
-        <w:pStyle w:val="NormalWeb"/>
-        <w:numPr>
-          <w:ilvl w:val="0"/>
-          <w:numId w:val="15"/>
-        </w:numPr>
-        <w:rPr>
-          <w:rStyle w:val="Strong"/>
-          <w:rFonts w:ascii="Arial" w:eastAsiaTheme="majorEastAsia" w:hAnsi="Arial" w:cs="Arial"/>
-          <w:b w:val="0"/>
-          <w:bCs w:val="0"/>
-          <w:sz w:val="18"/>
-          <w:szCs w:val="18"/>
-          <w:highlight w:val="yellow"/>
-        </w:rPr>
-      </w:pPr>
-      <w:r>
-        <w:rPr>
-          <w:rStyle w:val="Strong"/>
-          <w:rFonts w:ascii="Arial" w:eastAsiaTheme="majorEastAsia" w:hAnsi="Arial" w:cs="Arial"/>
-          <w:b w:val="0"/>
-          <w:bCs w:val="0"/>
-          <w:sz w:val="18"/>
-          <w:szCs w:val="18"/>
-          <w:highlight w:val="yellow"/>
-        </w:rPr>
-        <w:t>Microservices architecture allows teams to</w:t>
-      </w:r>
-      <w:r>
-        <w:rPr>
-          <w:rStyle w:val="Strong"/>
-          <w:rFonts w:ascii="Arial" w:eastAsiaTheme="majorEastAsia" w:hAnsi="Arial" w:cs="Arial"/>
-          <w:b w:val="0"/>
-          <w:bCs w:val="0"/>
-          <w:sz w:val="18"/>
-          <w:szCs w:val="18"/>
-          <w:highlight w:val="yellow"/>
-        </w:rPr>
-        <w:t xml:space="preserve"> (horizontal)</w:t>
-      </w:r>
-      <w:r>
-        <w:rPr>
-          <w:rStyle w:val="Strong"/>
-          <w:rFonts w:ascii="Arial" w:eastAsiaTheme="majorEastAsia" w:hAnsi="Arial" w:cs="Arial"/>
-          <w:b w:val="0"/>
-          <w:bCs w:val="0"/>
-          <w:sz w:val="18"/>
-          <w:szCs w:val="18"/>
-          <w:highlight w:val="yellow"/>
-        </w:rPr>
-        <w:t xml:space="preserve"> scale independently by focusing on individual services</w:t>
-      </w:r>
-      <w:r>
-        <w:rPr>
-          <w:rStyle w:val="Strong"/>
-          <w:rFonts w:ascii="Arial" w:eastAsiaTheme="majorEastAsia" w:hAnsi="Arial" w:cs="Arial"/>
-          <w:b w:val="0"/>
-          <w:bCs w:val="0"/>
-          <w:sz w:val="18"/>
-          <w:szCs w:val="18"/>
-          <w:highlight w:val="yellow"/>
-        </w:rPr>
-        <w:t xml:space="preserve"> </w:t>
-      </w:r>
-      <w:r>
-        <w:rPr>
-          <w:rStyle w:val="Strong"/>
-          <w:rFonts w:ascii="Arial" w:eastAsiaTheme="majorEastAsia" w:hAnsi="Arial" w:cs="Arial"/>
-          <w:sz w:val="18"/>
-          <w:szCs w:val="18"/>
-          <w:highlight w:val="yellow"/>
-        </w:rPr>
-        <w:t>but not for IoT</w:t>
-      </w:r>
-    </w:p>
-    <w:p>
-      <w:pPr>
-        <w:pStyle w:val="NormalWeb"/>
-        <w:numPr>
-          <w:ilvl w:val="0"/>
-          <w:numId w:val="15"/>
-        </w:numPr>
-        <w:rPr>
-          <w:rStyle w:val="Strong"/>
-          <w:rFonts w:ascii="Arial" w:eastAsiaTheme="majorEastAsia" w:hAnsi="Arial" w:cs="Arial"/>
-          <w:b w:val="0"/>
-          <w:bCs w:val="0"/>
-          <w:sz w:val="18"/>
-          <w:szCs w:val="18"/>
-        </w:rPr>
-      </w:pPr>
-      <w:r>
-        <w:rPr>
-          <w:rStyle w:val="Strong"/>
-          <w:rFonts w:ascii="Arial" w:eastAsiaTheme="majorEastAsia" w:hAnsi="Arial" w:cs="Arial"/>
-          <w:b w:val="0"/>
-          <w:bCs w:val="0"/>
-          <w:sz w:val="18"/>
-          <w:szCs w:val="18"/>
-        </w:rPr>
-        <w:t>A monolithic architecture limits</w:t>
-      </w:r>
-      <w:r>
-        <w:rPr>
-          <w:rStyle w:val="Strong"/>
-          <w:rFonts w:ascii="Arial" w:eastAsiaTheme="majorEastAsia" w:hAnsi="Arial" w:cs="Arial"/>
-          <w:b w:val="0"/>
-          <w:bCs w:val="0"/>
-          <w:sz w:val="18"/>
-          <w:szCs w:val="18"/>
-        </w:rPr>
-        <w:t xml:space="preserve"> (horizontal)</w:t>
-      </w:r>
-      <w:r>
-        <w:rPr>
-          <w:rStyle w:val="Strong"/>
-          <w:rFonts w:ascii="Arial" w:eastAsiaTheme="majorEastAsia" w:hAnsi="Arial" w:cs="Arial"/>
-          <w:b w:val="0"/>
-          <w:bCs w:val="0"/>
-          <w:sz w:val="18"/>
-          <w:szCs w:val="18"/>
-        </w:rPr>
-        <w:t xml:space="preserve"> scalability due to tightly coupled components</w:t>
-      </w:r>
-    </w:p>
-    <w:p>
-      <w:pPr>
-        <w:pStyle w:val="NormalWeb"/>
-        <w:numPr>
-          <w:ilvl w:val="0"/>
-          <w:numId w:val="15"/>
-        </w:numPr>
-        <w:rPr>
-          <w:rStyle w:val="Strong"/>
-          <w:rFonts w:ascii="Arial" w:eastAsiaTheme="majorEastAsia" w:hAnsi="Arial" w:cs="Arial"/>
-          <w:b w:val="0"/>
-          <w:bCs w:val="0"/>
-          <w:sz w:val="18"/>
-          <w:szCs w:val="18"/>
-        </w:rPr>
-      </w:pPr>
-      <w:r>
-        <w:rPr>
-          <w:rStyle w:val="Strong"/>
-          <w:rFonts w:ascii="Arial" w:eastAsiaTheme="majorEastAsia" w:hAnsi="Arial" w:cs="Arial"/>
-          <w:b w:val="0"/>
-          <w:bCs w:val="0"/>
-          <w:sz w:val="18"/>
-          <w:szCs w:val="18"/>
-        </w:rPr>
-        <w:t>Layered design requires more teams for each layer,</w:t>
-      </w:r>
-      <w:r>
-        <w:rPr>
-          <w:rStyle w:val="Strong"/>
-          <w:rFonts w:ascii="Arial" w:eastAsiaTheme="majorEastAsia" w:hAnsi="Arial" w:cs="Arial"/>
-          <w:b w:val="0"/>
-          <w:bCs w:val="0"/>
-          <w:sz w:val="18"/>
-          <w:szCs w:val="18"/>
-        </w:rPr>
-        <w:t xml:space="preserve"> but it scales easily</w:t>
-      </w:r>
-    </w:p>
-    <w:p>
-      <w:pPr>
-        <w:pStyle w:val="NormalWeb"/>
-        <w:numPr>
-          <w:ilvl w:val="0"/>
-          <w:numId w:val="15"/>
-        </w:numPr>
-        <w:rPr>
-          <w:rFonts w:ascii="Arial" w:hAnsi="Arial" w:cs="Arial"/>
-          <w:sz w:val="18"/>
-          <w:szCs w:val="18"/>
-        </w:rPr>
-      </w:pPr>
-      <w:r>
-        <w:rPr>
-          <w:rStyle w:val="Strong"/>
-          <w:rFonts w:ascii="Arial" w:eastAsiaTheme="majorEastAsia" w:hAnsi="Arial" w:cs="Arial"/>
-          <w:b w:val="0"/>
-          <w:bCs w:val="0"/>
-          <w:sz w:val="18"/>
-          <w:szCs w:val="18"/>
-        </w:rPr>
-        <w:t>Serverless architecture scales automatically, requiring no extra team effort</w:t>
-      </w:r>
-    </w:p>
-    <w:p>
-      <w:pPr>
-        <w:pStyle w:val="NormalWeb"/>
-        <w:numPr>
-          <w:ilvl w:val="0"/>
-          <w:numId w:val="26"/>
-        </w:numPr>
-        <w:rPr>
-          <w:rFonts w:ascii="Arial" w:hAnsi="Arial" w:cs="Arial"/>
-          <w:sz w:val="18"/>
-          <w:szCs w:val="18"/>
-        </w:rPr>
-      </w:pPr>
-      <w:r>
-        <w:rPr>
-          <w:rStyle w:val="Strong"/>
-          <w:rFonts w:ascii="Arial" w:eastAsiaTheme="majorEastAsia" w:hAnsi="Arial" w:cs="Arial"/>
-          <w:sz w:val="18"/>
-          <w:szCs w:val="18"/>
-        </w:rPr>
-        <w:t>How does the V-Model address compliance</w:t>
-      </w:r>
-      <w:r>
-        <w:rPr>
-          <w:rStyle w:val="Strong"/>
-          <w:rFonts w:ascii="Arial" w:eastAsiaTheme="majorEastAsia" w:hAnsi="Arial" w:cs="Arial"/>
-          <w:sz w:val="18"/>
-          <w:szCs w:val="18"/>
-        </w:rPr>
-        <w:t xml:space="preserve"> with legal requirements</w:t>
-      </w:r>
-      <w:r>
-        <w:rPr>
-          <w:rStyle w:val="Strong"/>
-          <w:rFonts w:ascii="Arial" w:eastAsiaTheme="majorEastAsia" w:hAnsi="Arial" w:cs="Arial"/>
-          <w:sz w:val="18"/>
-          <w:szCs w:val="18"/>
-        </w:rPr>
-        <w:t>?</w:t>
-      </w:r>
-    </w:p>
-    <w:p>
-      <w:pPr>
-        <w:pStyle w:val="NormalWeb"/>
-        <w:numPr>
-          <w:ilvl w:val="0"/>
-          <w:numId w:val="3"/>
-        </w:numPr>
-        <w:rPr>
-          <w:rFonts w:ascii="Arial" w:hAnsi="Arial" w:cs="Arial"/>
-          <w:sz w:val="18"/>
-          <w:szCs w:val="18"/>
-        </w:rPr>
-      </w:pPr>
-      <w:r>
-        <w:rPr>
-          <w:rFonts w:ascii="Arial" w:hAnsi="Arial" w:cs="Arial"/>
-          <w:sz w:val="18"/>
-          <w:szCs w:val="18"/>
-        </w:rPr>
-        <w:t>By ensuring legal compliance is checked only during the deployment phase</w:t>
-      </w:r>
-    </w:p>
-    <w:p>
-      <w:pPr>
-        <w:pStyle w:val="NormalWeb"/>
-        <w:numPr>
-          <w:ilvl w:val="0"/>
-          <w:numId w:val="3"/>
-        </w:numPr>
-        <w:rPr>
-          <w:rFonts w:ascii="Arial" w:hAnsi="Arial" w:cs="Arial"/>
-          <w:sz w:val="18"/>
-          <w:szCs w:val="18"/>
-          <w:highlight w:val="yellow"/>
-        </w:rPr>
-      </w:pPr>
-      <w:r>
-        <w:rPr>
-          <w:rFonts w:ascii="Arial" w:hAnsi="Arial" w:cs="Arial"/>
-          <w:sz w:val="18"/>
-          <w:szCs w:val="18"/>
-          <w:highlight w:val="yellow"/>
-        </w:rPr>
-        <w:t xml:space="preserve">Through </w:t>
-      </w:r>
-      <w:r>
-        <w:rPr>
-          <w:rFonts w:ascii="Arial" w:hAnsi="Arial" w:cs="Arial"/>
-          <w:sz w:val="18"/>
-          <w:szCs w:val="18"/>
-          <w:highlight w:val="yellow"/>
-        </w:rPr>
-        <w:t xml:space="preserve">emphasize on </w:t>
-      </w:r>
-      <w:r>
-        <w:rPr>
-          <w:rFonts w:ascii="Arial" w:hAnsi="Arial" w:cs="Arial"/>
-          <w:sz w:val="18"/>
-          <w:szCs w:val="18"/>
-          <w:highlight w:val="yellow"/>
-        </w:rPr>
-        <w:t>verification</w:t>
-      </w:r>
-      <w:r>
-        <w:rPr>
-          <w:rFonts w:ascii="Arial" w:hAnsi="Arial" w:cs="Arial"/>
-          <w:sz w:val="18"/>
-          <w:szCs w:val="18"/>
-          <w:highlight w:val="yellow"/>
-        </w:rPr>
-        <w:t xml:space="preserve">, </w:t>
-      </w:r>
-      <w:r>
-        <w:rPr>
-          <w:rFonts w:ascii="Arial" w:hAnsi="Arial" w:cs="Arial"/>
-          <w:sz w:val="18"/>
-          <w:szCs w:val="18"/>
-          <w:highlight w:val="yellow"/>
-        </w:rPr>
-        <w:t>validation</w:t>
-      </w:r>
-      <w:r>
-        <w:rPr>
-          <w:rFonts w:ascii="Arial" w:hAnsi="Arial" w:cs="Arial"/>
-          <w:sz w:val="18"/>
-          <w:szCs w:val="18"/>
-          <w:highlight w:val="yellow"/>
-        </w:rPr>
-        <w:t>, and</w:t>
-      </w:r>
-      <w:r>
-        <w:rPr>
-          <w:rFonts w:ascii="Arial" w:hAnsi="Arial" w:cs="Arial"/>
-          <w:sz w:val="18"/>
-          <w:szCs w:val="18"/>
-          <w:highlight w:val="yellow"/>
-        </w:rPr>
-        <w:t xml:space="preserve"> testing</w:t>
-      </w:r>
-    </w:p>
-    <w:p>
-      <w:pPr>
-        <w:pStyle w:val="NormalWeb"/>
-        <w:numPr>
-          <w:ilvl w:val="0"/>
-          <w:numId w:val="3"/>
-        </w:numPr>
-        <w:rPr>
-          <w:rFonts w:ascii="Arial" w:hAnsi="Arial" w:cs="Arial"/>
-          <w:sz w:val="18"/>
-          <w:szCs w:val="18"/>
-        </w:rPr>
-      </w:pPr>
-      <w:r>
-        <w:rPr>
-          <w:rFonts w:ascii="Arial" w:hAnsi="Arial" w:cs="Arial"/>
-          <w:sz w:val="18"/>
-          <w:szCs w:val="18"/>
-        </w:rPr>
-        <w:t>By skipping testing and focusing solely on design and documentation</w:t>
-      </w:r>
-    </w:p>
-    <w:p>
-      <w:pPr>
-        <w:pStyle w:val="NormalWeb"/>
-        <w:numPr>
-          <w:ilvl w:val="0"/>
-          <w:numId w:val="3"/>
-        </w:numPr>
-        <w:rPr>
-          <w:rFonts w:ascii="Arial" w:hAnsi="Arial" w:cs="Arial"/>
-          <w:sz w:val="18"/>
-          <w:szCs w:val="18"/>
-        </w:rPr>
-      </w:pPr>
-      <w:r>
-        <w:rPr>
-          <w:rFonts w:ascii="Arial" w:hAnsi="Arial" w:cs="Arial"/>
-          <w:sz w:val="18"/>
-          <w:szCs w:val="18"/>
-        </w:rPr>
-        <w:t>By relying on external audits after the project is completed</w:t>
-      </w:r>
-    </w:p>
-    <w:p>
-      <w:pPr>
-        <w:pStyle w:val="NormalWeb"/>
-        <w:numPr>
-          <w:ilvl w:val="0"/>
-          <w:numId w:val="26"/>
-        </w:numPr>
-        <w:rPr>
-          <w:rFonts w:ascii="Arial" w:hAnsi="Arial" w:cs="Arial"/>
-          <w:sz w:val="18"/>
-          <w:szCs w:val="18"/>
-        </w:rPr>
-      </w:pPr>
-      <w:r>
-        <w:rPr>
-          <w:rStyle w:val="Strong"/>
-          <w:rFonts w:ascii="Arial" w:eastAsiaTheme="majorEastAsia" w:hAnsi="Arial" w:cs="Arial"/>
-          <w:sz w:val="18"/>
-          <w:szCs w:val="18"/>
-        </w:rPr>
-        <w:t>What is the difference between verification, validation, and testing?</w:t>
-      </w:r>
-    </w:p>
-    <w:p>
-      <w:pPr>
-        <w:pStyle w:val="NormalWeb"/>
-        <w:numPr>
-          <w:ilvl w:val="0"/>
-          <w:numId w:val="4"/>
-        </w:numPr>
-        <w:rPr>
-          <w:rFonts w:ascii="Arial" w:hAnsi="Arial" w:cs="Arial"/>
-          <w:sz w:val="18"/>
-          <w:szCs w:val="18"/>
-        </w:rPr>
-      </w:pPr>
-      <w:r>
-        <w:rPr>
-          <w:rFonts w:ascii="Arial" w:hAnsi="Arial" w:cs="Arial"/>
-          <w:sz w:val="18"/>
-          <w:szCs w:val="18"/>
-        </w:rPr>
-        <w:t xml:space="preserve">Verification ensures </w:t>
-      </w:r>
-      <w:r>
-        <w:rPr>
-          <w:rFonts w:ascii="Arial" w:hAnsi="Arial" w:cs="Arial"/>
-          <w:sz w:val="18"/>
-          <w:szCs w:val="18"/>
-        </w:rPr>
-        <w:t>user/customer</w:t>
-      </w:r>
-      <w:r>
-        <w:rPr>
-          <w:rFonts w:ascii="Arial" w:hAnsi="Arial" w:cs="Arial"/>
-          <w:sz w:val="18"/>
-          <w:szCs w:val="18"/>
-        </w:rPr>
-        <w:t xml:space="preserve"> needs, validation checks functionality, and testing finds bugs</w:t>
-      </w:r>
-    </w:p>
-    <w:p>
-      <w:pPr>
-        <w:pStyle w:val="NormalWeb"/>
-        <w:numPr>
-          <w:ilvl w:val="0"/>
-          <w:numId w:val="4"/>
-        </w:numPr>
-        <w:rPr>
-          <w:rFonts w:ascii="Arial" w:hAnsi="Arial" w:cs="Arial"/>
-          <w:sz w:val="18"/>
-          <w:szCs w:val="18"/>
-          <w:highlight w:val="yellow"/>
-        </w:rPr>
-      </w:pPr>
-      <w:r>
-        <w:rPr>
-          <w:rFonts w:ascii="Arial" w:hAnsi="Arial" w:cs="Arial"/>
-          <w:sz w:val="18"/>
-          <w:szCs w:val="18"/>
-          <w:highlight w:val="yellow"/>
-        </w:rPr>
-        <w:t>Verification checks requirements, validation checks the right problem, and testing checks</w:t>
-      </w:r>
-      <w:r>
-        <w:rPr>
-          <w:rFonts w:ascii="Arial" w:hAnsi="Arial" w:cs="Arial"/>
-          <w:sz w:val="18"/>
-          <w:szCs w:val="18"/>
-          <w:highlight w:val="yellow"/>
-        </w:rPr>
-        <w:t xml:space="preserve"> errors</w:t>
-      </w:r>
-    </w:p>
-    <w:p>
-      <w:pPr>
-        <w:pStyle w:val="NormalWeb"/>
-        <w:numPr>
-          <w:ilvl w:val="0"/>
-          <w:numId w:val="4"/>
-        </w:numPr>
-        <w:rPr>
-          <w:rFonts w:ascii="Arial" w:hAnsi="Arial" w:cs="Arial"/>
-          <w:sz w:val="18"/>
-          <w:szCs w:val="18"/>
-        </w:rPr>
-      </w:pPr>
-      <w:r>
-        <w:rPr>
-          <w:rFonts w:ascii="Arial" w:hAnsi="Arial" w:cs="Arial"/>
-          <w:sz w:val="18"/>
-          <w:szCs w:val="18"/>
-        </w:rPr>
-        <w:t>Verification and validation are the same, testing is done at the end</w:t>
-      </w:r>
-    </w:p>
-    <w:p>
-      <w:pPr>
-        <w:pStyle w:val="NormalWeb"/>
-        <w:numPr>
-          <w:ilvl w:val="0"/>
-          <w:numId w:val="4"/>
-        </w:numPr>
-        <w:rPr>
-          <w:rFonts w:ascii="Arial" w:hAnsi="Arial" w:cs="Arial"/>
-          <w:sz w:val="18"/>
-          <w:szCs w:val="18"/>
-        </w:rPr>
-      </w:pPr>
-      <w:r>
-        <w:rPr>
-          <w:rFonts w:ascii="Arial" w:hAnsi="Arial" w:cs="Arial"/>
-          <w:sz w:val="18"/>
-          <w:szCs w:val="18"/>
-        </w:rPr>
-        <w:t>Verification is during implementation, validation post-deployment, and no testing needed</w:t>
-      </w:r>
-    </w:p>
-    <w:p>
-      <w:pPr>
-        <w:pStyle w:val="NormalWeb"/>
-        <w:numPr>
-          <w:ilvl w:val="0"/>
-          <w:numId w:val="26"/>
-        </w:numPr>
-        <w:rPr>
-          <w:rFonts w:ascii="Arial" w:hAnsi="Arial" w:cs="Arial"/>
-          <w:sz w:val="18"/>
-          <w:szCs w:val="18"/>
-        </w:rPr>
-      </w:pPr>
-      <w:r>
-        <w:rPr>
-          <w:rStyle w:val="Strong"/>
-          <w:rFonts w:ascii="Arial" w:eastAsiaTheme="majorEastAsia" w:hAnsi="Arial" w:cs="Arial"/>
-          <w:sz w:val="18"/>
-          <w:szCs w:val="18"/>
-        </w:rPr>
-        <w:t>Which of the following best describes the "Arrange, Act, Assert"</w:t>
-      </w:r>
-      <w:r>
-        <w:rPr>
-          <w:rStyle w:val="Strong"/>
-          <w:rFonts w:ascii="Arial" w:eastAsiaTheme="majorEastAsia" w:hAnsi="Arial" w:cs="Arial"/>
-          <w:sz w:val="18"/>
-          <w:szCs w:val="18"/>
-        </w:rPr>
-        <w:t xml:space="preserve"> (AAA)</w:t>
-      </w:r>
-      <w:r>
-        <w:rPr>
-          <w:rStyle w:val="Strong"/>
-          <w:rFonts w:ascii="Arial" w:eastAsiaTheme="majorEastAsia" w:hAnsi="Arial" w:cs="Arial"/>
-          <w:sz w:val="18"/>
-          <w:szCs w:val="18"/>
-        </w:rPr>
-        <w:t xml:space="preserve"> pattern in testing?</w:t>
-      </w:r>
-    </w:p>
-    <w:p>
-      <w:pPr>
-        <w:pStyle w:val="NormalWeb"/>
-        <w:numPr>
-          <w:ilvl w:val="0"/>
-          <w:numId w:val="5"/>
-        </w:numPr>
-        <w:rPr>
-          <w:rFonts w:ascii="Arial" w:hAnsi="Arial" w:cs="Arial"/>
-          <w:sz w:val="18"/>
-          <w:szCs w:val="18"/>
-        </w:rPr>
-      </w:pPr>
-      <w:r>
-        <w:rPr>
-          <w:rFonts w:ascii="Arial" w:hAnsi="Arial" w:cs="Arial"/>
-          <w:sz w:val="18"/>
-          <w:szCs w:val="18"/>
-        </w:rPr>
-        <w:t xml:space="preserve">Arrange the </w:t>
-      </w:r>
-      <w:r>
-        <w:rPr>
-          <w:rFonts w:ascii="Arial" w:hAnsi="Arial" w:cs="Arial"/>
-          <w:sz w:val="18"/>
-          <w:szCs w:val="18"/>
-        </w:rPr>
-        <w:t>function</w:t>
-      </w:r>
-      <w:r>
-        <w:rPr>
-          <w:rFonts w:ascii="Arial" w:hAnsi="Arial" w:cs="Arial"/>
-          <w:sz w:val="18"/>
-          <w:szCs w:val="18"/>
-        </w:rPr>
-        <w:t>, assert expected behavior, and act to test</w:t>
-      </w:r>
-    </w:p>
-    <w:p>
-      <w:pPr>
-        <w:pStyle w:val="NormalWeb"/>
-        <w:numPr>
-          <w:ilvl w:val="0"/>
-          <w:numId w:val="5"/>
-        </w:numPr>
-        <w:rPr>
-          <w:rFonts w:ascii="Arial" w:hAnsi="Arial" w:cs="Arial"/>
-          <w:sz w:val="18"/>
-          <w:szCs w:val="18"/>
-        </w:rPr>
-      </w:pPr>
-      <w:proofErr w:type="spellStart"/>
-      <w:r>
-        <w:rPr>
-          <w:rFonts w:ascii="Arial" w:hAnsi="Arial" w:cs="Arial"/>
-          <w:sz w:val="18"/>
-          <w:szCs w:val="18"/>
-        </w:rPr>
-        <w:t>Act</w:t>
-      </w:r>
-      <w:proofErr w:type="spellEnd"/>
-      <w:r>
-        <w:rPr>
-          <w:rFonts w:ascii="Arial" w:hAnsi="Arial" w:cs="Arial"/>
-          <w:sz w:val="18"/>
-          <w:szCs w:val="18"/>
-        </w:rPr>
-        <w:t xml:space="preserve"> first, then arrange test data, and finally assert the expected result</w:t>
-      </w:r>
-    </w:p>
-    <w:p>
-      <w:pPr>
-        <w:pStyle w:val="NormalWeb"/>
-        <w:numPr>
-          <w:ilvl w:val="0"/>
-          <w:numId w:val="5"/>
-        </w:numPr>
-        <w:rPr>
-          <w:rFonts w:ascii="Arial" w:hAnsi="Arial" w:cs="Arial"/>
-          <w:sz w:val="18"/>
-          <w:szCs w:val="18"/>
-          <w:highlight w:val="yellow"/>
-        </w:rPr>
-      </w:pPr>
-      <w:r>
-        <w:rPr>
-          <w:rFonts w:ascii="Arial" w:hAnsi="Arial" w:cs="Arial"/>
-          <w:sz w:val="18"/>
-          <w:szCs w:val="18"/>
-          <w:highlight w:val="yellow"/>
-        </w:rPr>
-        <w:t>Arrange test data, act on the system, and assert the outcome</w:t>
-      </w:r>
-    </w:p>
-    <w:p>
-      <w:pPr>
-        <w:pStyle w:val="NormalWeb"/>
-        <w:numPr>
-          <w:ilvl w:val="0"/>
-          <w:numId w:val="5"/>
-        </w:numPr>
-        <w:rPr>
-          <w:rFonts w:ascii="Arial" w:hAnsi="Arial" w:cs="Arial"/>
-          <w:sz w:val="18"/>
-          <w:szCs w:val="18"/>
-        </w:rPr>
-      </w:pPr>
-      <w:r>
-        <w:rPr>
-          <w:rFonts w:ascii="Arial" w:hAnsi="Arial" w:cs="Arial"/>
-          <w:sz w:val="18"/>
-          <w:szCs w:val="18"/>
-        </w:rPr>
-        <w:t>Assert the behavior, act to modify it, and arrange the conditions</w:t>
-      </w:r>
-    </w:p>
-    <w:p>
-      <w:pPr>
-        <w:pStyle w:val="NormalWeb"/>
-        <w:numPr>
-          <w:ilvl w:val="0"/>
-          <w:numId w:val="26"/>
-        </w:numPr>
-        <w:rPr>
-          <w:rFonts w:ascii="Arial" w:hAnsi="Arial" w:cs="Arial"/>
-          <w:sz w:val="18"/>
-          <w:szCs w:val="18"/>
-        </w:rPr>
-      </w:pPr>
-      <w:r>
-        <w:rPr>
-          <w:rStyle w:val="Strong"/>
-          <w:rFonts w:ascii="Arial" w:eastAsiaTheme="majorEastAsia" w:hAnsi="Arial" w:cs="Arial"/>
-          <w:sz w:val="18"/>
-          <w:szCs w:val="18"/>
-        </w:rPr>
-        <w:t>Why is the AAA testing principle useful?</w:t>
-      </w:r>
-    </w:p>
-    <w:p>
-      <w:pPr>
-        <w:pStyle w:val="NormalWeb"/>
-        <w:numPr>
-          <w:ilvl w:val="0"/>
-          <w:numId w:val="6"/>
-        </w:numPr>
-        <w:rPr>
-          <w:rFonts w:ascii="Arial" w:hAnsi="Arial" w:cs="Arial"/>
-          <w:sz w:val="18"/>
-          <w:szCs w:val="18"/>
-        </w:rPr>
-      </w:pPr>
-      <w:r>
-        <w:rPr>
-          <w:rFonts w:ascii="Arial" w:hAnsi="Arial" w:cs="Arial"/>
-          <w:sz w:val="18"/>
-          <w:szCs w:val="18"/>
-        </w:rPr>
-        <w:t>It is only useful for unit tests</w:t>
-      </w:r>
-    </w:p>
-    <w:p>
-      <w:pPr>
-        <w:pStyle w:val="NormalWeb"/>
-        <w:numPr>
-          <w:ilvl w:val="0"/>
-          <w:numId w:val="6"/>
-        </w:numPr>
-        <w:rPr>
-          <w:rFonts w:ascii="Arial" w:hAnsi="Arial" w:cs="Arial"/>
-          <w:sz w:val="18"/>
-          <w:szCs w:val="18"/>
-        </w:rPr>
-      </w:pPr>
-      <w:r>
-        <w:rPr>
-          <w:rFonts w:ascii="Arial" w:hAnsi="Arial" w:cs="Arial"/>
-          <w:sz w:val="18"/>
-          <w:szCs w:val="18"/>
-        </w:rPr>
-        <w:t>It limits tests to Arrange and Assert steps</w:t>
-      </w:r>
-    </w:p>
-    <w:p>
-      <w:pPr>
-        <w:pStyle w:val="NormalWeb"/>
-        <w:numPr>
-          <w:ilvl w:val="0"/>
-          <w:numId w:val="6"/>
-        </w:numPr>
-        <w:rPr>
-          <w:rFonts w:ascii="Arial" w:hAnsi="Arial" w:cs="Arial"/>
-          <w:sz w:val="18"/>
-          <w:szCs w:val="18"/>
-          <w:highlight w:val="yellow"/>
-        </w:rPr>
-      </w:pPr>
-      <w:r>
-        <w:rPr>
-          <w:rFonts w:ascii="Arial" w:hAnsi="Arial" w:cs="Arial"/>
-          <w:sz w:val="18"/>
-          <w:szCs w:val="18"/>
-          <w:highlight w:val="yellow"/>
-        </w:rPr>
-        <w:t>It provides structured tests for all levels</w:t>
-      </w:r>
-    </w:p>
-    <w:p>
-      <w:pPr>
-        <w:pStyle w:val="NormalWeb"/>
-        <w:numPr>
-          <w:ilvl w:val="0"/>
-          <w:numId w:val="6"/>
-        </w:numPr>
-        <w:rPr>
-          <w:rFonts w:ascii="Arial" w:hAnsi="Arial" w:cs="Arial"/>
-          <w:sz w:val="18"/>
-          <w:szCs w:val="18"/>
-        </w:rPr>
-      </w:pPr>
-      <w:r>
-        <w:rPr>
-          <w:rFonts w:ascii="Arial" w:hAnsi="Arial" w:cs="Arial"/>
-          <w:sz w:val="18"/>
-          <w:szCs w:val="18"/>
-        </w:rPr>
-        <w:t>It works only for low-level tests</w:t>
-      </w:r>
-    </w:p>
-    <w:p>
-      <w:pPr>
-        <w:pStyle w:val="NormalWeb"/>
-        <w:rPr>
-          <w:rStyle w:val="Strong"/>
-          <w:rFonts w:ascii="Arial" w:eastAsiaTheme="majorEastAsia" w:hAnsi="Arial" w:cs="Arial"/>
-          <w:sz w:val="18"/>
-          <w:szCs w:val="18"/>
-        </w:rPr>
-      </w:pPr>
-    </w:p>
-    <w:p>
-      <w:pPr>
-        <w:pStyle w:val="NormalWeb"/>
-        <w:rPr>
-          <w:rStyle w:val="Strong"/>
-          <w:rFonts w:ascii="Arial" w:eastAsiaTheme="majorEastAsia" w:hAnsi="Arial" w:cs="Arial"/>
-          <w:sz w:val="18"/>
-          <w:szCs w:val="18"/>
-        </w:rPr>
-      </w:pPr>
-    </w:p>
-    <w:p>
-      <w:pPr>
-        <w:pStyle w:val="NormalWeb"/>
-        <w:numPr>
-          <w:ilvl w:val="0"/>
-          <w:numId w:val="26"/>
-        </w:numPr>
-        <w:rPr>
-          <w:rStyle w:val="Strong"/>
-          <w:rFonts w:ascii="Arial" w:eastAsiaTheme="majorEastAsia" w:hAnsi="Arial" w:cs="Arial"/>
-          <w:sz w:val="18"/>
-          <w:szCs w:val="18"/>
-        </w:rPr>
-      </w:pPr>
-      <w:r>
-        <w:rPr>
-          <w:rStyle w:val="Strong"/>
-          <w:rFonts w:ascii="Arial" w:eastAsiaTheme="majorEastAsia" w:hAnsi="Arial" w:cs="Arial"/>
-          <w:sz w:val="18"/>
-          <w:szCs w:val="18"/>
-        </w:rPr>
-        <w:t>Which stage of the V-Model typically generates the most bug tickets in a plant watering IoT system?</w:t>
-      </w:r>
-    </w:p>
-    <w:p>
-      <w:pPr>
-        <w:pStyle w:val="NormalWeb"/>
-        <w:numPr>
-          <w:ilvl w:val="0"/>
-          <w:numId w:val="19"/>
-        </w:numPr>
-        <w:rPr>
-          <w:rStyle w:val="Strong"/>
-          <w:rFonts w:ascii="Arial" w:eastAsiaTheme="majorEastAsia" w:hAnsi="Arial" w:cs="Arial"/>
-          <w:b w:val="0"/>
-          <w:bCs w:val="0"/>
-          <w:sz w:val="18"/>
-          <w:szCs w:val="18"/>
-        </w:rPr>
-      </w:pPr>
-      <w:r>
-        <w:rPr>
-          <w:rStyle w:val="Strong"/>
-          <w:rFonts w:ascii="Arial" w:eastAsiaTheme="majorEastAsia" w:hAnsi="Arial" w:cs="Arial"/>
-          <w:b w:val="0"/>
-          <w:bCs w:val="0"/>
-          <w:sz w:val="18"/>
-          <w:szCs w:val="18"/>
-        </w:rPr>
-        <w:t xml:space="preserve">System </w:t>
-      </w:r>
-      <w:r>
-        <w:rPr>
-          <w:rStyle w:val="Strong"/>
-          <w:rFonts w:ascii="Arial" w:eastAsiaTheme="majorEastAsia" w:hAnsi="Arial" w:cs="Arial"/>
-          <w:b w:val="0"/>
-          <w:bCs w:val="0"/>
-          <w:sz w:val="18"/>
-          <w:szCs w:val="18"/>
-        </w:rPr>
-        <w:t>testing</w:t>
-      </w:r>
-    </w:p>
-    <w:p>
-      <w:pPr>
-        <w:pStyle w:val="NormalWeb"/>
-        <w:numPr>
-          <w:ilvl w:val="0"/>
-          <w:numId w:val="19"/>
-        </w:numPr>
-        <w:rPr>
-          <w:rStyle w:val="Strong"/>
-          <w:rFonts w:ascii="Arial" w:eastAsiaTheme="majorEastAsia" w:hAnsi="Arial" w:cs="Arial"/>
-          <w:b w:val="0"/>
-          <w:bCs w:val="0"/>
-          <w:sz w:val="18"/>
-          <w:szCs w:val="18"/>
-          <w:highlight w:val="yellow"/>
-        </w:rPr>
-      </w:pPr>
-      <w:r>
-        <w:rPr>
-          <w:rStyle w:val="Strong"/>
-          <w:rFonts w:ascii="Arial" w:eastAsiaTheme="majorEastAsia" w:hAnsi="Arial" w:cs="Arial"/>
-          <w:b w:val="0"/>
-          <w:bCs w:val="0"/>
-          <w:sz w:val="18"/>
-          <w:szCs w:val="18"/>
-          <w:highlight w:val="yellow"/>
-        </w:rPr>
-        <w:t>Integration testing</w:t>
-      </w:r>
-    </w:p>
-    <w:p>
-      <w:pPr>
-        <w:pStyle w:val="NormalWeb"/>
-        <w:numPr>
-          <w:ilvl w:val="0"/>
-          <w:numId w:val="19"/>
-        </w:numPr>
-        <w:rPr>
-          <w:rStyle w:val="Strong"/>
-          <w:rFonts w:ascii="Arial" w:eastAsiaTheme="majorEastAsia" w:hAnsi="Arial" w:cs="Arial"/>
-          <w:b w:val="0"/>
-          <w:bCs w:val="0"/>
-          <w:sz w:val="18"/>
-          <w:szCs w:val="18"/>
-        </w:rPr>
-      </w:pPr>
-      <w:r>
-        <w:rPr>
-          <w:rStyle w:val="Strong"/>
-          <w:rFonts w:ascii="Arial" w:eastAsiaTheme="majorEastAsia" w:hAnsi="Arial" w:cs="Arial"/>
-          <w:b w:val="0"/>
-          <w:bCs w:val="0"/>
-          <w:sz w:val="18"/>
-          <w:szCs w:val="18"/>
-        </w:rPr>
-        <w:t>Component testing</w:t>
-      </w:r>
-    </w:p>
-    <w:p>
-      <w:pPr>
-        <w:pStyle w:val="NormalWeb"/>
-        <w:numPr>
-          <w:ilvl w:val="0"/>
-          <w:numId w:val="19"/>
-        </w:numPr>
-        <w:rPr>
-          <w:rStyle w:val="Strong"/>
-          <w:rFonts w:ascii="Arial" w:eastAsiaTheme="majorEastAsia" w:hAnsi="Arial" w:cs="Arial"/>
-          <w:b w:val="0"/>
-          <w:bCs w:val="0"/>
-          <w:sz w:val="18"/>
-          <w:szCs w:val="18"/>
-        </w:rPr>
-      </w:pPr>
-      <w:r>
-        <w:rPr>
-          <w:rStyle w:val="Strong"/>
-          <w:rFonts w:ascii="Arial" w:eastAsiaTheme="majorEastAsia" w:hAnsi="Arial" w:cs="Arial"/>
-          <w:b w:val="0"/>
-          <w:bCs w:val="0"/>
-          <w:sz w:val="18"/>
-          <w:szCs w:val="18"/>
-        </w:rPr>
-        <w:t>Unit testing</w:t>
-      </w:r>
-    </w:p>
-    <w:p>
-      <w:pPr>
-        <w:pStyle w:val="NormalWeb"/>
-        <w:numPr>
-          <w:ilvl w:val="0"/>
-          <w:numId w:val="26"/>
-        </w:numPr>
-        <w:rPr>
-          <w:rStyle w:val="Strong"/>
-          <w:rFonts w:ascii="Arial" w:eastAsiaTheme="majorEastAsia" w:hAnsi="Arial" w:cs="Arial"/>
-          <w:sz w:val="18"/>
-          <w:szCs w:val="18"/>
-        </w:rPr>
-      </w:pPr>
-      <w:r>
-        <w:rPr>
-          <w:rStyle w:val="Strong"/>
-          <w:rFonts w:ascii="Arial" w:eastAsiaTheme="majorEastAsia" w:hAnsi="Arial" w:cs="Arial"/>
-          <w:sz w:val="18"/>
-          <w:szCs w:val="18"/>
-        </w:rPr>
-        <w:t xml:space="preserve">How do alpha, beta, and gamma tests relate to </w:t>
-      </w:r>
-      <w:r>
-        <w:rPr>
-          <w:rStyle w:val="Strong"/>
-          <w:rFonts w:ascii="Arial" w:eastAsiaTheme="majorEastAsia" w:hAnsi="Arial" w:cs="Arial"/>
-          <w:sz w:val="18"/>
-          <w:szCs w:val="18"/>
-        </w:rPr>
-        <w:t>V-Model</w:t>
-      </w:r>
-      <w:r>
-        <w:rPr>
-          <w:rStyle w:val="Strong"/>
-          <w:rFonts w:ascii="Arial" w:eastAsiaTheme="majorEastAsia" w:hAnsi="Arial" w:cs="Arial"/>
-          <w:sz w:val="18"/>
-          <w:szCs w:val="18"/>
-        </w:rPr>
-        <w:t xml:space="preserve"> testing?</w:t>
-      </w:r>
-    </w:p>
-    <w:p>
-      <w:pPr>
-        <w:pStyle w:val="NormalWeb"/>
-        <w:numPr>
-          <w:ilvl w:val="0"/>
-          <w:numId w:val="22"/>
-        </w:numPr>
-        <w:rPr>
-          <w:rStyle w:val="Strong"/>
-          <w:rFonts w:ascii="Arial" w:eastAsiaTheme="majorEastAsia" w:hAnsi="Arial" w:cs="Arial"/>
-          <w:b w:val="0"/>
-          <w:bCs w:val="0"/>
-          <w:sz w:val="18"/>
-          <w:szCs w:val="18"/>
-        </w:rPr>
-      </w:pPr>
-      <w:r>
-        <w:rPr>
-          <w:rStyle w:val="Strong"/>
-          <w:rFonts w:ascii="Arial" w:eastAsiaTheme="majorEastAsia" w:hAnsi="Arial" w:cs="Arial"/>
-          <w:b w:val="0"/>
-          <w:bCs w:val="0"/>
-          <w:sz w:val="18"/>
-          <w:szCs w:val="18"/>
-        </w:rPr>
-        <w:t xml:space="preserve">They </w:t>
-      </w:r>
-      <w:r>
-        <w:rPr>
-          <w:rStyle w:val="Strong"/>
-          <w:rFonts w:ascii="Arial" w:eastAsiaTheme="majorEastAsia" w:hAnsi="Arial" w:cs="Arial"/>
-          <w:b w:val="0"/>
-          <w:bCs w:val="0"/>
-          <w:sz w:val="18"/>
-          <w:szCs w:val="18"/>
-        </w:rPr>
-        <w:t>are not required in V-Model, but nice to have</w:t>
-      </w:r>
-    </w:p>
-    <w:p>
-      <w:pPr>
-        <w:pStyle w:val="NormalWeb"/>
-        <w:numPr>
-          <w:ilvl w:val="0"/>
-          <w:numId w:val="22"/>
-        </w:numPr>
-        <w:rPr>
-          <w:rStyle w:val="Strong"/>
-          <w:rFonts w:ascii="Arial" w:eastAsiaTheme="majorEastAsia" w:hAnsi="Arial" w:cs="Arial"/>
-          <w:b w:val="0"/>
-          <w:bCs w:val="0"/>
-          <w:sz w:val="18"/>
-          <w:szCs w:val="18"/>
-          <w:highlight w:val="yellow"/>
-        </w:rPr>
-      </w:pPr>
-      <w:r>
-        <w:rPr>
-          <w:rStyle w:val="Strong"/>
-          <w:rFonts w:ascii="Arial" w:eastAsiaTheme="majorEastAsia" w:hAnsi="Arial" w:cs="Arial"/>
-          <w:b w:val="0"/>
-          <w:bCs w:val="0"/>
-          <w:sz w:val="18"/>
-          <w:szCs w:val="18"/>
-          <w:highlight w:val="yellow"/>
-        </w:rPr>
-        <w:t>They extend it with real user</w:t>
-      </w:r>
-      <w:r>
-        <w:rPr>
-          <w:rStyle w:val="Strong"/>
-          <w:rFonts w:ascii="Arial" w:eastAsiaTheme="majorEastAsia" w:hAnsi="Arial" w:cs="Arial"/>
-          <w:b w:val="0"/>
-          <w:bCs w:val="0"/>
-          <w:sz w:val="18"/>
-          <w:szCs w:val="18"/>
-          <w:highlight w:val="yellow"/>
-        </w:rPr>
-        <w:t xml:space="preserve"> testing</w:t>
-      </w:r>
-    </w:p>
-    <w:p>
-      <w:pPr>
-        <w:pStyle w:val="NormalWeb"/>
-        <w:numPr>
-          <w:ilvl w:val="0"/>
-          <w:numId w:val="22"/>
-        </w:numPr>
-        <w:rPr>
-          <w:rStyle w:val="Strong"/>
-          <w:rFonts w:ascii="Arial" w:eastAsiaTheme="majorEastAsia" w:hAnsi="Arial" w:cs="Arial"/>
-          <w:b w:val="0"/>
-          <w:bCs w:val="0"/>
-          <w:sz w:val="18"/>
-          <w:szCs w:val="18"/>
-        </w:rPr>
-      </w:pPr>
-      <w:r>
-        <w:rPr>
-          <w:rStyle w:val="Strong"/>
-          <w:rFonts w:ascii="Arial" w:eastAsiaTheme="majorEastAsia" w:hAnsi="Arial" w:cs="Arial"/>
-          <w:b w:val="0"/>
-          <w:bCs w:val="0"/>
-          <w:sz w:val="18"/>
-          <w:szCs w:val="18"/>
-        </w:rPr>
-        <w:t xml:space="preserve">They test </w:t>
-      </w:r>
-      <w:r>
-        <w:rPr>
-          <w:rStyle w:val="Strong"/>
-          <w:rFonts w:ascii="Arial" w:eastAsiaTheme="majorEastAsia" w:hAnsi="Arial" w:cs="Arial"/>
-          <w:b w:val="0"/>
-          <w:bCs w:val="0"/>
-          <w:sz w:val="18"/>
-          <w:szCs w:val="18"/>
-        </w:rPr>
-        <w:t xml:space="preserve">software </w:t>
-      </w:r>
-      <w:r>
-        <w:rPr>
-          <w:rStyle w:val="Strong"/>
-          <w:rFonts w:ascii="Arial" w:eastAsiaTheme="majorEastAsia" w:hAnsi="Arial" w:cs="Arial"/>
-          <w:b w:val="0"/>
-          <w:bCs w:val="0"/>
-          <w:sz w:val="18"/>
-          <w:szCs w:val="18"/>
-        </w:rPr>
-        <w:t>hardware</w:t>
-      </w:r>
-      <w:r>
-        <w:rPr>
-          <w:rStyle w:val="Strong"/>
-          <w:rFonts w:ascii="Arial" w:eastAsiaTheme="majorEastAsia" w:hAnsi="Arial" w:cs="Arial"/>
-          <w:b w:val="0"/>
-          <w:bCs w:val="0"/>
-          <w:sz w:val="18"/>
-          <w:szCs w:val="18"/>
-        </w:rPr>
-        <w:t xml:space="preserve"> integration</w:t>
-      </w:r>
-    </w:p>
-    <w:p>
-      <w:pPr>
-        <w:pStyle w:val="NormalWeb"/>
-        <w:numPr>
-          <w:ilvl w:val="0"/>
-          <w:numId w:val="22"/>
-        </w:numPr>
-        <w:rPr>
-          <w:rStyle w:val="Strong"/>
-          <w:rFonts w:ascii="Arial" w:eastAsiaTheme="majorEastAsia" w:hAnsi="Arial" w:cs="Arial"/>
-          <w:sz w:val="18"/>
-          <w:szCs w:val="18"/>
-        </w:rPr>
-      </w:pPr>
-      <w:r>
-        <w:rPr>
-          <w:rStyle w:val="Strong"/>
-          <w:rFonts w:ascii="Arial" w:eastAsiaTheme="majorEastAsia" w:hAnsi="Arial" w:cs="Arial"/>
-          <w:b w:val="0"/>
-          <w:bCs w:val="0"/>
-          <w:sz w:val="18"/>
-          <w:szCs w:val="18"/>
-        </w:rPr>
-        <w:t>They follow failed unit tests</w:t>
-      </w:r>
-    </w:p>
-    <w:p>
-      <w:pPr>
-        <w:pStyle w:val="NormalWeb"/>
-        <w:numPr>
-          <w:ilvl w:val="0"/>
-          <w:numId w:val="26"/>
-        </w:numPr>
+        </w:rPr>
+        <w:t>By constantly sending data to the cloud, regardless of battery status</w:t>
+      </w:r>
+    </w:p>
+    <w:p>
+      <w:pPr>
+        <w:pStyle w:val="NormalWeb"/>
         <w:rPr>
           <w:rFonts w:ascii="Arial" w:hAnsi="Arial" w:cs="Arial"/>
           <w:b/>
@@ -2439,7 +2994,10 @@
           <w:szCs w:val="18"/>
         </w:rPr>
       </w:pPr>
-      <w:r>
+    </w:p>
+    <w:p>
+      <w:pPr>
+        <w:pStyle w:val="NormalWeb"/>
         <w:rPr>
           <w:rFonts w:ascii="Arial" w:hAnsi="Arial" w:cs="Arial"/>
           <w:b/>
@@ -2447,133 +3005,7 @@
           <w:sz w:val="18"/>
           <w:szCs w:val="18"/>
         </w:rPr>
-        <w:t>By integrating Scrum into the V-Model, we can:</w:t>
-      </w:r>
-    </w:p>
-    <w:p>
-      <w:pPr>
-        <w:pStyle w:val="NormalWeb"/>
-        <w:numPr>
-          <w:ilvl w:val="0"/>
-          <w:numId w:val="24"/>
-        </w:numPr>
-        <w:rPr>
-          <w:rFonts w:ascii="Arial" w:hAnsi="Arial" w:cs="Arial"/>
-          <w:sz w:val="18"/>
-          <w:szCs w:val="18"/>
-        </w:rPr>
-      </w:pPr>
-      <w:r>
-        <w:rPr>
-          <w:rFonts w:ascii="Arial" w:hAnsi="Arial" w:cs="Arial"/>
-          <w:sz w:val="18"/>
-          <w:szCs w:val="18"/>
-          <w:highlight w:val="yellow"/>
-        </w:rPr>
-        <w:t>Validate</w:t>
-      </w:r>
-      <w:r>
-        <w:rPr>
-          <w:rFonts w:ascii="Arial" w:hAnsi="Arial" w:cs="Arial"/>
-          <w:sz w:val="18"/>
-          <w:szCs w:val="18"/>
-          <w:highlight w:val="yellow"/>
-        </w:rPr>
-        <w:t xml:space="preserve"> much</w:t>
-      </w:r>
-      <w:r>
-        <w:rPr>
-          <w:rFonts w:ascii="Arial" w:hAnsi="Arial" w:cs="Arial"/>
-          <w:sz w:val="18"/>
-          <w:szCs w:val="18"/>
-          <w:highlight w:val="yellow"/>
-        </w:rPr>
-        <w:t xml:space="preserve"> earlier</w:t>
-      </w:r>
-    </w:p>
-    <w:p>
-      <w:pPr>
-        <w:pStyle w:val="NormalWeb"/>
-        <w:numPr>
-          <w:ilvl w:val="0"/>
-          <w:numId w:val="24"/>
-        </w:numPr>
-        <w:rPr>
-          <w:rFonts w:ascii="Arial" w:hAnsi="Arial" w:cs="Arial"/>
-          <w:sz w:val="18"/>
-          <w:szCs w:val="18"/>
-        </w:rPr>
-      </w:pPr>
-      <w:r>
-        <w:rPr>
-          <w:rFonts w:ascii="Arial" w:hAnsi="Arial" w:cs="Arial"/>
-          <w:sz w:val="18"/>
-          <w:szCs w:val="18"/>
-        </w:rPr>
-        <w:t>Verify</w:t>
-      </w:r>
-      <w:r>
-        <w:rPr>
-          <w:rFonts w:ascii="Arial" w:hAnsi="Arial" w:cs="Arial"/>
-          <w:sz w:val="18"/>
-          <w:szCs w:val="18"/>
-        </w:rPr>
-        <w:t xml:space="preserve"> much</w:t>
-      </w:r>
-      <w:r>
-        <w:rPr>
-          <w:rFonts w:ascii="Arial" w:hAnsi="Arial" w:cs="Arial"/>
-          <w:sz w:val="18"/>
-          <w:szCs w:val="18"/>
-        </w:rPr>
-        <w:t xml:space="preserve"> </w:t>
-      </w:r>
-      <w:r>
-        <w:rPr>
-          <w:rFonts w:ascii="Arial" w:hAnsi="Arial" w:cs="Arial"/>
-          <w:sz w:val="18"/>
-          <w:szCs w:val="18"/>
-        </w:rPr>
-        <w:t>earlier</w:t>
-      </w:r>
-    </w:p>
-    <w:p>
-      <w:pPr>
-        <w:pStyle w:val="NormalWeb"/>
-        <w:numPr>
-          <w:ilvl w:val="0"/>
-          <w:numId w:val="24"/>
-        </w:numPr>
-        <w:rPr>
-          <w:rFonts w:ascii="Arial" w:hAnsi="Arial" w:cs="Arial"/>
-          <w:sz w:val="18"/>
-          <w:szCs w:val="18"/>
-        </w:rPr>
-      </w:pPr>
-      <w:r>
-        <w:rPr>
-          <w:rFonts w:ascii="Arial" w:hAnsi="Arial" w:cs="Arial"/>
-          <w:sz w:val="18"/>
-          <w:szCs w:val="18"/>
-        </w:rPr>
-        <w:t xml:space="preserve">Test </w:t>
-      </w:r>
-      <w:r>
-        <w:rPr>
-          <w:rFonts w:ascii="Arial" w:hAnsi="Arial" w:cs="Arial"/>
-          <w:sz w:val="18"/>
-          <w:szCs w:val="18"/>
-        </w:rPr>
-        <w:t xml:space="preserve">much </w:t>
-      </w:r>
-      <w:r>
-        <w:rPr>
-          <w:rFonts w:ascii="Arial" w:hAnsi="Arial" w:cs="Arial"/>
-          <w:sz w:val="18"/>
-          <w:szCs w:val="18"/>
-        </w:rPr>
-        <w:t>earlier</w:t>
-      </w:r>
+      </w:pPr>
     </w:p>
     <w:p>
       <w:pPr>
@@ -2598,603 +3030,6 @@
           <w:sz w:val="18"/>
           <w:szCs w:val="18"/>
         </w:rPr>
-        <w:t xml:space="preserve">Which level of testing in the V-Model is usually the most </w:t>
-      </w:r>
-      <w:r>
-        <w:rPr>
-          <w:rFonts w:ascii="Arial" w:hAnsi="Arial" w:cs="Arial"/>
-          <w:b/>
-          <w:bCs/>
-          <w:sz w:val="18"/>
-          <w:szCs w:val="18"/>
-        </w:rPr>
-        <w:t>difficult</w:t>
-      </w:r>
-      <w:r>
-        <w:rPr>
-          <w:rFonts w:ascii="Arial" w:hAnsi="Arial" w:cs="Arial"/>
-          <w:b/>
-          <w:bCs/>
-          <w:sz w:val="18"/>
-          <w:szCs w:val="18"/>
-        </w:rPr>
-        <w:t xml:space="preserve"> to fix if issues are found?</w:t>
-      </w:r>
-    </w:p>
-    <w:p>
-      <w:pPr>
-        <w:pStyle w:val="NormalWeb"/>
-        <w:numPr>
-          <w:ilvl w:val="0"/>
-          <w:numId w:val="23"/>
-        </w:numPr>
-        <w:rPr>
-          <w:rFonts w:ascii="Arial" w:hAnsi="Arial" w:cs="Arial"/>
-          <w:sz w:val="18"/>
-          <w:szCs w:val="18"/>
-        </w:rPr>
-      </w:pPr>
-      <w:r>
-        <w:rPr>
-          <w:rFonts w:ascii="Arial" w:hAnsi="Arial" w:cs="Arial"/>
-          <w:sz w:val="18"/>
-          <w:szCs w:val="18"/>
-        </w:rPr>
-        <w:t>Unit testing</w:t>
-      </w:r>
-    </w:p>
-    <w:p>
-      <w:pPr>
-        <w:pStyle w:val="NormalWeb"/>
-        <w:numPr>
-          <w:ilvl w:val="0"/>
-          <w:numId w:val="23"/>
-        </w:numPr>
-        <w:rPr>
-          <w:rFonts w:ascii="Arial" w:hAnsi="Arial" w:cs="Arial"/>
-          <w:sz w:val="18"/>
-          <w:szCs w:val="18"/>
-        </w:rPr>
-      </w:pPr>
-      <w:r>
-        <w:rPr>
-          <w:rFonts w:ascii="Arial" w:hAnsi="Arial" w:cs="Arial"/>
-          <w:sz w:val="18"/>
-          <w:szCs w:val="18"/>
-        </w:rPr>
-        <w:t>Component testing</w:t>
-      </w:r>
-    </w:p>
-    <w:p>
-      <w:pPr>
-        <w:pStyle w:val="NormalWeb"/>
-        <w:numPr>
-          <w:ilvl w:val="0"/>
-          <w:numId w:val="23"/>
-        </w:numPr>
-        <w:rPr>
-          <w:rFonts w:ascii="Arial" w:hAnsi="Arial" w:cs="Arial"/>
-          <w:sz w:val="18"/>
-          <w:szCs w:val="18"/>
-        </w:rPr>
-      </w:pPr>
-      <w:r>
-        <w:rPr>
-          <w:rFonts w:ascii="Arial" w:hAnsi="Arial" w:cs="Arial"/>
-          <w:sz w:val="18"/>
-          <w:szCs w:val="18"/>
-        </w:rPr>
-        <w:t>Integration testing</w:t>
-      </w:r>
-    </w:p>
-    <w:p>
-      <w:pPr>
-        <w:pStyle w:val="NormalWeb"/>
-        <w:numPr>
-          <w:ilvl w:val="0"/>
-          <w:numId w:val="23"/>
-        </w:numPr>
-        <w:rPr>
-          <w:rFonts w:ascii="Arial" w:hAnsi="Arial" w:cs="Arial"/>
-          <w:b/>
-          <w:bCs/>
-          <w:sz w:val="18"/>
-          <w:szCs w:val="18"/>
-          <w:highlight w:val="yellow"/>
-        </w:rPr>
-      </w:pPr>
-      <w:r>
-        <w:rPr>
-          <w:rFonts w:ascii="Arial" w:hAnsi="Arial" w:cs="Arial"/>
-          <w:sz w:val="18"/>
-          <w:szCs w:val="18"/>
-          <w:highlight w:val="yellow"/>
-        </w:rPr>
-        <w:t>System testing</w:t>
-      </w:r>
-    </w:p>
-    <w:p>
-      <w:pPr>
-        <w:pStyle w:val="NormalWeb"/>
-        <w:numPr>
-          <w:ilvl w:val="0"/>
-          <w:numId w:val="26"/>
-        </w:numPr>
-        <w:rPr>
-          <w:rFonts w:ascii="Arial" w:hAnsi="Arial" w:cs="Arial"/>
-          <w:b/>
-          <w:bCs/>
-          <w:sz w:val="18"/>
-          <w:szCs w:val="18"/>
-        </w:rPr>
-      </w:pPr>
-      <w:r>
-        <w:rPr>
-          <w:rFonts w:ascii="Arial" w:hAnsi="Arial" w:cs="Arial"/>
-          <w:b/>
-          <w:bCs/>
-          <w:sz w:val="18"/>
-          <w:szCs w:val="18"/>
-        </w:rPr>
-        <w:t>W</w:t>
-      </w:r>
-      <w:r>
-        <w:rPr>
-          <w:rFonts w:ascii="Arial" w:hAnsi="Arial" w:cs="Arial"/>
-          <w:b/>
-          <w:bCs/>
-          <w:sz w:val="18"/>
-          <w:szCs w:val="18"/>
-        </w:rPr>
-        <w:t xml:space="preserve">hich part of plant watering system </w:t>
-      </w:r>
-      <w:r>
-        <w:rPr>
-          <w:rFonts w:ascii="Arial" w:hAnsi="Arial" w:cs="Arial"/>
-          <w:b/>
-          <w:bCs/>
-          <w:sz w:val="18"/>
-          <w:szCs w:val="18"/>
-        </w:rPr>
-        <w:t>fits</w:t>
-      </w:r>
-      <w:r>
-        <w:rPr>
-          <w:rFonts w:ascii="Arial" w:hAnsi="Arial" w:cs="Arial"/>
-          <w:b/>
-          <w:bCs/>
-          <w:sz w:val="18"/>
-          <w:szCs w:val="18"/>
-        </w:rPr>
-        <w:t xml:space="preserve"> user-based access control?</w:t>
-      </w:r>
-    </w:p>
-    <w:p>
-      <w:pPr>
-        <w:pStyle w:val="NormalWeb"/>
-        <w:numPr>
-          <w:ilvl w:val="0"/>
-          <w:numId w:val="20"/>
-        </w:numPr>
-        <w:rPr>
-          <w:rFonts w:ascii="Arial" w:hAnsi="Arial" w:cs="Arial"/>
-          <w:sz w:val="18"/>
-          <w:szCs w:val="18"/>
-          <w:highlight w:val="yellow"/>
-        </w:rPr>
-      </w:pPr>
-      <w:r>
-        <w:rPr>
-          <w:rFonts w:ascii="Arial" w:hAnsi="Arial" w:cs="Arial"/>
-          <w:sz w:val="18"/>
-          <w:szCs w:val="18"/>
-          <w:highlight w:val="yellow"/>
-        </w:rPr>
-        <w:t>Embedded</w:t>
-      </w:r>
-    </w:p>
-    <w:p>
-      <w:pPr>
-        <w:pStyle w:val="NormalWeb"/>
-        <w:numPr>
-          <w:ilvl w:val="0"/>
-          <w:numId w:val="20"/>
-        </w:numPr>
-        <w:rPr>
-          <w:rFonts w:ascii="Arial" w:hAnsi="Arial" w:cs="Arial"/>
-          <w:sz w:val="18"/>
-          <w:szCs w:val="18"/>
-          <w:highlight w:val="yellow"/>
-        </w:rPr>
-      </w:pPr>
-      <w:r>
-        <w:rPr>
-          <w:rFonts w:ascii="Arial" w:hAnsi="Arial" w:cs="Arial"/>
-          <w:sz w:val="18"/>
-          <w:szCs w:val="18"/>
-          <w:highlight w:val="yellow"/>
-        </w:rPr>
-        <w:t>Backend</w:t>
-      </w:r>
-    </w:p>
-    <w:p>
-      <w:pPr>
-        <w:pStyle w:val="NormalWeb"/>
-        <w:numPr>
-          <w:ilvl w:val="0"/>
-          <w:numId w:val="20"/>
-        </w:numPr>
-        <w:rPr>
-          <w:rFonts w:ascii="Arial" w:hAnsi="Arial" w:cs="Arial"/>
-          <w:sz w:val="18"/>
-          <w:szCs w:val="18"/>
-          <w:highlight w:val="yellow"/>
-        </w:rPr>
-      </w:pPr>
-      <w:r>
-        <w:rPr>
-          <w:rFonts w:ascii="Arial" w:hAnsi="Arial" w:cs="Arial"/>
-          <w:sz w:val="18"/>
-          <w:szCs w:val="18"/>
-          <w:highlight w:val="yellow"/>
-        </w:rPr>
-        <w:t>Database</w:t>
-      </w:r>
-    </w:p>
-    <w:p>
-      <w:pPr>
-        <w:pStyle w:val="NormalWeb"/>
-        <w:numPr>
-          <w:ilvl w:val="0"/>
-          <w:numId w:val="20"/>
-        </w:numPr>
-        <w:rPr>
-          <w:rFonts w:ascii="Arial" w:hAnsi="Arial" w:cs="Arial"/>
-          <w:sz w:val="18"/>
-          <w:szCs w:val="18"/>
-          <w:highlight w:val="yellow"/>
-        </w:rPr>
-      </w:pPr>
-      <w:r>
-        <w:rPr>
-          <w:rFonts w:ascii="Arial" w:hAnsi="Arial" w:cs="Arial"/>
-          <w:sz w:val="18"/>
-          <w:szCs w:val="18"/>
-          <w:highlight w:val="yellow"/>
-        </w:rPr>
-        <w:t>Frontend</w:t>
-      </w:r>
-    </w:p>
-    <w:p>
-      <w:pPr>
-        <w:pStyle w:val="NormalWeb"/>
-        <w:numPr>
-          <w:ilvl w:val="0"/>
-          <w:numId w:val="26"/>
-        </w:numPr>
-        <w:rPr>
-          <w:rStyle w:val="Strong"/>
-          <w:rFonts w:ascii="Arial" w:eastAsiaTheme="majorEastAsia" w:hAnsi="Arial" w:cs="Arial"/>
-          <w:sz w:val="18"/>
-          <w:szCs w:val="18"/>
-        </w:rPr>
-      </w:pPr>
-      <w:r>
-        <w:rPr>
-          <w:rStyle w:val="Strong"/>
-          <w:rFonts w:ascii="Arial" w:eastAsiaTheme="majorEastAsia" w:hAnsi="Arial" w:cs="Arial"/>
-          <w:sz w:val="18"/>
-          <w:szCs w:val="18"/>
-        </w:rPr>
-        <w:t>How can you ensure that the plant water sensor is providing accurate data over time?</w:t>
-      </w:r>
-    </w:p>
-    <w:p>
-      <w:pPr>
-        <w:pStyle w:val="NormalWeb"/>
-        <w:numPr>
-          <w:ilvl w:val="0"/>
-          <w:numId w:val="16"/>
-        </w:numPr>
-        <w:rPr>
-          <w:rStyle w:val="Strong"/>
-          <w:rFonts w:ascii="Arial" w:eastAsiaTheme="majorEastAsia" w:hAnsi="Arial" w:cs="Arial"/>
-          <w:b w:val="0"/>
-          <w:bCs w:val="0"/>
-          <w:sz w:val="18"/>
-          <w:szCs w:val="18"/>
-        </w:rPr>
-      </w:pPr>
-      <w:r>
-        <w:rPr>
-          <w:rStyle w:val="Strong"/>
-          <w:rFonts w:ascii="Arial" w:eastAsiaTheme="majorEastAsia" w:hAnsi="Arial" w:cs="Arial"/>
-          <w:b w:val="0"/>
-          <w:bCs w:val="0"/>
-          <w:sz w:val="18"/>
-          <w:szCs w:val="18"/>
-        </w:rPr>
-        <w:t>B</w:t>
-      </w:r>
-      <w:r>
-        <w:rPr>
-          <w:rStyle w:val="Strong"/>
-          <w:rFonts w:ascii="Arial" w:eastAsiaTheme="majorEastAsia" w:hAnsi="Arial" w:cs="Arial"/>
-          <w:b w:val="0"/>
-          <w:bCs w:val="0"/>
-          <w:sz w:val="18"/>
-          <w:szCs w:val="18"/>
-          <w:highlight w:val="yellow"/>
-        </w:rPr>
-        <w:t>y running periodic calibration checks against a known reference</w:t>
-      </w:r>
-    </w:p>
-    <w:p>
-      <w:pPr>
-        <w:pStyle w:val="NormalWeb"/>
-        <w:numPr>
-          <w:ilvl w:val="0"/>
-          <w:numId w:val="16"/>
-        </w:numPr>
-        <w:rPr>
-          <w:rStyle w:val="Strong"/>
-          <w:rFonts w:ascii="Arial" w:eastAsiaTheme="majorEastAsia" w:hAnsi="Arial" w:cs="Arial"/>
-          <w:b w:val="0"/>
-          <w:bCs w:val="0"/>
-          <w:sz w:val="18"/>
-          <w:szCs w:val="18"/>
-        </w:rPr>
-      </w:pPr>
-      <w:r>
-        <w:rPr>
-          <w:rStyle w:val="Strong"/>
-          <w:rFonts w:ascii="Arial" w:eastAsiaTheme="majorEastAsia" w:hAnsi="Arial" w:cs="Arial"/>
-          <w:b w:val="0"/>
-          <w:bCs w:val="0"/>
-          <w:sz w:val="18"/>
-          <w:szCs w:val="18"/>
-        </w:rPr>
-        <w:t>By assuming the sensor will maintain accuracy without testing</w:t>
-      </w:r>
-    </w:p>
-    <w:p>
-      <w:pPr>
-        <w:pStyle w:val="NormalWeb"/>
-        <w:numPr>
-          <w:ilvl w:val="0"/>
-          <w:numId w:val="16"/>
-        </w:numPr>
-        <w:rPr>
-          <w:rStyle w:val="Strong"/>
-          <w:rFonts w:ascii="Arial" w:eastAsiaTheme="majorEastAsia" w:hAnsi="Arial" w:cs="Arial"/>
-          <w:b w:val="0"/>
-          <w:bCs w:val="0"/>
-          <w:sz w:val="18"/>
-          <w:szCs w:val="18"/>
-        </w:rPr>
-      </w:pPr>
-      <w:r>
-        <w:rPr>
-          <w:rStyle w:val="Strong"/>
-          <w:rFonts w:ascii="Arial" w:eastAsiaTheme="majorEastAsia" w:hAnsi="Arial" w:cs="Arial"/>
-          <w:b w:val="0"/>
-          <w:bCs w:val="0"/>
-          <w:sz w:val="18"/>
-          <w:szCs w:val="18"/>
-        </w:rPr>
-        <w:t>By testing the sensor only during the initial installation</w:t>
-      </w:r>
-    </w:p>
-    <w:p>
-      <w:pPr>
-        <w:pStyle w:val="NormalWeb"/>
-        <w:numPr>
-          <w:ilvl w:val="0"/>
-          <w:numId w:val="16"/>
-        </w:numPr>
-        <w:rPr>
-          <w:rFonts w:ascii="Arial" w:eastAsiaTheme="majorEastAsia" w:hAnsi="Arial" w:cs="Arial"/>
-          <w:sz w:val="18"/>
-          <w:szCs w:val="18"/>
-        </w:rPr>
-      </w:pPr>
-      <w:r>
-        <w:rPr>
-          <w:rStyle w:val="Strong"/>
-          <w:rFonts w:ascii="Arial" w:eastAsiaTheme="majorEastAsia" w:hAnsi="Arial" w:cs="Arial"/>
-          <w:b w:val="0"/>
-          <w:bCs w:val="0"/>
-          <w:sz w:val="18"/>
-          <w:szCs w:val="18"/>
-        </w:rPr>
-        <w:t>By monitoring the system for sensor errors after deployment</w:t>
-      </w:r>
-    </w:p>
-    <w:p>
-      <w:pPr>
-        <w:pStyle w:val="NormalWeb"/>
-        <w:numPr>
-          <w:ilvl w:val="0"/>
-          <w:numId w:val="26"/>
-        </w:numPr>
-        <w:rPr>
-          <w:rStyle w:val="Strong"/>
-          <w:rFonts w:ascii="Arial" w:eastAsiaTheme="majorEastAsia" w:hAnsi="Arial" w:cs="Arial"/>
-          <w:sz w:val="18"/>
-          <w:szCs w:val="18"/>
-        </w:rPr>
-      </w:pPr>
-      <w:r>
-        <w:rPr>
-          <w:rStyle w:val="Strong"/>
-          <w:rFonts w:ascii="Arial" w:eastAsiaTheme="majorEastAsia" w:hAnsi="Arial" w:cs="Arial"/>
-          <w:sz w:val="18"/>
-          <w:szCs w:val="18"/>
-        </w:rPr>
-        <w:t>How can you optimize battery life in embedded devices used for a plant watering IoT system?</w:t>
-      </w:r>
-    </w:p>
-    <w:p>
-      <w:pPr>
-        <w:pStyle w:val="NormalWeb"/>
-        <w:numPr>
-          <w:ilvl w:val="0"/>
-          <w:numId w:val="17"/>
-        </w:numPr>
-        <w:rPr>
-          <w:rStyle w:val="Strong"/>
-          <w:rFonts w:ascii="Arial" w:eastAsiaTheme="majorEastAsia" w:hAnsi="Arial" w:cs="Arial"/>
-          <w:b w:val="0"/>
-          <w:bCs w:val="0"/>
-          <w:sz w:val="18"/>
-          <w:szCs w:val="18"/>
-        </w:rPr>
-      </w:pPr>
-      <w:r>
-        <w:rPr>
-          <w:rStyle w:val="Strong"/>
-          <w:rFonts w:ascii="Arial" w:eastAsiaTheme="majorEastAsia" w:hAnsi="Arial" w:cs="Arial"/>
-          <w:b w:val="0"/>
-          <w:bCs w:val="0"/>
-          <w:sz w:val="18"/>
-          <w:szCs w:val="18"/>
-        </w:rPr>
-        <w:t>By using high-power sensors for continuous data collection</w:t>
-      </w:r>
-    </w:p>
-    <w:p>
-      <w:pPr>
-        <w:pStyle w:val="NormalWeb"/>
-        <w:numPr>
-          <w:ilvl w:val="0"/>
-          <w:numId w:val="17"/>
-        </w:numPr>
-        <w:rPr>
-          <w:rStyle w:val="Strong"/>
-          <w:rFonts w:ascii="Arial" w:eastAsiaTheme="majorEastAsia" w:hAnsi="Arial" w:cs="Arial"/>
-          <w:b w:val="0"/>
-          <w:bCs w:val="0"/>
-          <w:sz w:val="18"/>
-          <w:szCs w:val="18"/>
-          <w:highlight w:val="yellow"/>
-        </w:rPr>
-      </w:pPr>
-      <w:r>
-        <w:rPr>
-          <w:rStyle w:val="Strong"/>
-          <w:rFonts w:ascii="Arial" w:eastAsiaTheme="majorEastAsia" w:hAnsi="Arial" w:cs="Arial"/>
-          <w:b w:val="0"/>
-          <w:bCs w:val="0"/>
-          <w:sz w:val="18"/>
-          <w:szCs w:val="18"/>
-          <w:highlight w:val="yellow"/>
-        </w:rPr>
-        <w:t>By optimizing software to reduce processing and communication frequency</w:t>
-      </w:r>
-    </w:p>
-    <w:p>
-      <w:pPr>
-        <w:pStyle w:val="NormalWeb"/>
-        <w:numPr>
-          <w:ilvl w:val="0"/>
-          <w:numId w:val="17"/>
-        </w:numPr>
-        <w:rPr>
-          <w:rStyle w:val="Strong"/>
-          <w:rFonts w:ascii="Arial" w:eastAsiaTheme="majorEastAsia" w:hAnsi="Arial" w:cs="Arial"/>
-          <w:b w:val="0"/>
-          <w:bCs w:val="0"/>
-          <w:sz w:val="18"/>
-          <w:szCs w:val="18"/>
-        </w:rPr>
-      </w:pPr>
-      <w:r>
-        <w:rPr>
-          <w:rStyle w:val="Strong"/>
-          <w:rFonts w:ascii="Arial" w:eastAsiaTheme="majorEastAsia" w:hAnsi="Arial" w:cs="Arial"/>
-          <w:b w:val="0"/>
-          <w:bCs w:val="0"/>
-          <w:sz w:val="18"/>
-          <w:szCs w:val="18"/>
-        </w:rPr>
-        <w:t>By increasing the sensor's transmission range to collect more data</w:t>
-      </w:r>
-    </w:p>
-    <w:p>
-      <w:pPr>
-        <w:pStyle w:val="NormalWeb"/>
-        <w:numPr>
-          <w:ilvl w:val="0"/>
-          <w:numId w:val="17"/>
-        </w:numPr>
-        <w:rPr>
-          <w:rStyle w:val="Strong"/>
-          <w:rFonts w:ascii="Arial" w:hAnsi="Arial" w:cs="Arial"/>
-          <w:b w:val="0"/>
-          <w:bCs w:val="0"/>
-          <w:sz w:val="18"/>
-          <w:szCs w:val="18"/>
-        </w:rPr>
-      </w:pPr>
-      <w:r>
-        <w:rPr>
-          <w:rStyle w:val="Strong"/>
-          <w:rFonts w:ascii="Arial" w:eastAsiaTheme="majorEastAsia" w:hAnsi="Arial" w:cs="Arial"/>
-          <w:b w:val="0"/>
-          <w:bCs w:val="0"/>
-          <w:sz w:val="18"/>
-          <w:szCs w:val="18"/>
-        </w:rPr>
-        <w:t>By constantly sending data to the cloud, regardless of battery status</w:t>
-      </w:r>
-    </w:p>
-    <w:p>
-      <w:pPr>
-        <w:pStyle w:val="NormalWeb"/>
-        <w:rPr>
-          <w:rFonts w:ascii="Arial" w:hAnsi="Arial" w:cs="Arial"/>
-          <w:b/>
-          <w:bCs/>
-          <w:sz w:val="18"/>
-          <w:szCs w:val="18"/>
-        </w:rPr>
-      </w:pPr>
-    </w:p>
-    <w:p>
-      <w:pPr>
-        <w:pStyle w:val="NormalWeb"/>
-        <w:rPr>
-          <w:rFonts w:ascii="Arial" w:hAnsi="Arial" w:cs="Arial"/>
-          <w:b/>
-          <w:bCs/>
-          <w:sz w:val="18"/>
-          <w:szCs w:val="18"/>
-        </w:rPr>
-      </w:pPr>
-    </w:p>
-    <w:p>
-      <w:pPr>
-        <w:pStyle w:val="NormalWeb"/>
-        <w:numPr>
-          <w:ilvl w:val="0"/>
-          <w:numId w:val="26"/>
-        </w:numPr>
-        <w:rPr>
-          <w:rFonts w:ascii="Arial" w:hAnsi="Arial" w:cs="Arial"/>
-          <w:b/>
-          <w:bCs/>
-          <w:sz w:val="18"/>
-          <w:szCs w:val="18"/>
-        </w:rPr>
-      </w:pPr>
-      <w:r>
-        <w:rPr>
-          <w:rFonts w:ascii="Arial" w:hAnsi="Arial" w:cs="Arial"/>
-          <w:b/>
-          <w:bCs/>
-          <w:sz w:val="18"/>
-          <w:szCs w:val="18"/>
-        </w:rPr>
         <w:t>Why do IoT projects, like a plant watering system, often have a fixed completion date?</w:t>
       </w:r>
     </w:p>
@@ -3253,15 +3088,13 @@
           <w:rFonts w:ascii="Arial" w:hAnsi="Arial" w:cs="Arial"/>
           <w:sz w:val="18"/>
           <w:szCs w:val="18"/>
-          <w:highlight w:val="yellow"/>
-        </w:rPr>
-      </w:pPr>
-      <w:r>
-        <w:rPr>
-          <w:rFonts w:ascii="Arial" w:hAnsi="Arial" w:cs="Arial"/>
-          <w:sz w:val="18"/>
-          <w:szCs w:val="18"/>
-          <w:highlight w:val="yellow"/>
+        </w:rPr>
+      </w:pPr>
+      <w:r>
+        <w:rPr>
+          <w:rFonts w:ascii="Arial" w:hAnsi="Arial" w:cs="Arial"/>
+          <w:sz w:val="18"/>
+          <w:szCs w:val="18"/>
         </w:rPr>
         <w:t>Because production lines are often third-party with fixed time slots</w:t>
       </w:r>

</xml_diff>